<commit_message>
Change in profile content
</commit_message>
<xml_diff>
--- a/src/assets/documents/resume-cover_letter/Pankaj_Gupta_Senior_Angular_Frontend_Developer_CV.docx
+++ b/src/assets/documents/resume-cover_letter/Pankaj_Gupta_Senior_Angular_Frontend_Developer_CV.docx
@@ -7,18 +7,20 @@
         <w:spacing w:after="60"/>
         <w:ind w:left="-454" w:right="-454"/>
         <w:rPr>
-          <w:b/>
-          <w:bCs/>
-          <w:sz w:val="28"/>
-          <w:szCs w:val="28"/>
-        </w:rPr>
-      </w:pPr>
-      <w:r>
-        <w:rPr>
-          <w:b/>
-          <w:bCs/>
-          <w:sz w:val="28"/>
-          <w:szCs w:val="28"/>
+          <w:rFonts w:ascii="Times New Roman" w:hAnsi="Times New Roman" w:cs="Times New Roman"/>
+          <w:b/>
+          <w:bCs/>
+          <w:sz w:val="34"/>
+          <w:szCs w:val="34"/>
+        </w:rPr>
+      </w:pPr>
+      <w:r>
+        <w:rPr>
+          <w:rFonts w:ascii="Times New Roman" w:hAnsi="Times New Roman" w:cs="Times New Roman"/>
+          <w:b/>
+          <w:bCs/>
+          <w:sz w:val="34"/>
+          <w:szCs w:val="34"/>
         </w:rPr>
         <w:t>PANKAJ GUPTA</w:t>
       </w:r>
@@ -28,20 +30,42 @@
         <w:spacing w:after="0"/>
         <w:ind w:left="-454" w:right="-454"/>
         <w:rPr>
-          <w:b/>
-          <w:bCs/>
-          <w:sz w:val="22"/>
-          <w:szCs w:val="22"/>
-        </w:rPr>
-      </w:pPr>
-      <w:r>
-        <w:rPr>
-          <w:b/>
-          <w:bCs/>
-          <w:sz w:val="22"/>
-          <w:szCs w:val="22"/>
-        </w:rPr>
-        <w:t xml:space="preserve">Senior Angular Frontend Developer </w:t>
+          <w:rFonts w:ascii="Times New Roman" w:hAnsi="Times New Roman" w:cs="Times New Roman"/>
+          <w:b/>
+          <w:bCs/>
+          <w:sz w:val="22"/>
+          <w:szCs w:val="22"/>
+        </w:rPr>
+      </w:pPr>
+      <w:r>
+        <w:rPr>
+          <w:rFonts w:ascii="Times New Roman" w:hAnsi="Times New Roman" w:cs="Times New Roman"/>
+          <w:b/>
+          <w:bCs/>
+          <w:sz w:val="22"/>
+          <w:szCs w:val="22"/>
+        </w:rPr>
+        <w:t xml:space="preserve">Software Engineer | </w:t>
+      </w:r>
+      <w:r>
+        <w:rPr>
+          <w:rFonts w:ascii="Times New Roman" w:hAnsi="Times New Roman" w:cs="Times New Roman"/>
+          <w:b/>
+          <w:bCs/>
+          <w:sz w:val="22"/>
+          <w:szCs w:val="22"/>
+        </w:rPr>
+        <w:t xml:space="preserve">Senior Angular Frontend </w:t>
+      </w:r>
+      <w:r>
+        <w:rPr>
+          <w:rFonts w:ascii="Times New Roman" w:hAnsi="Times New Roman" w:cs="Times New Roman"/>
+          <w:b/>
+          <w:bCs/>
+          <w:sz w:val="22"/>
+          <w:szCs w:val="22"/>
+        </w:rPr>
+        <w:t>Engineer</w:t>
       </w:r>
     </w:p>
     <w:p>
@@ -49,86 +73,150 @@
         <w:spacing w:after="0"/>
         <w:ind w:left="-454" w:right="-454"/>
         <w:rPr>
-          <w:sz w:val="22"/>
-          <w:szCs w:val="22"/>
-        </w:rPr>
-      </w:pPr>
-      <w:r>
-        <w:rPr>
-          <w:sz w:val="22"/>
-          <w:szCs w:val="22"/>
-        </w:rPr>
-        <w:t xml:space="preserve">Current Location: </w:t>
-      </w:r>
-      <w:r>
-        <w:rPr>
-          <w:sz w:val="22"/>
-          <w:szCs w:val="22"/>
-        </w:rPr>
-        <w:t>Bengaluru, India | Open to Relocation</w:t>
-      </w:r>
-      <w:r>
-        <w:rPr>
+          <w:rFonts w:ascii="Times New Roman" w:hAnsi="Times New Roman" w:cs="Times New Roman"/>
+          <w:sz w:val="22"/>
+          <w:szCs w:val="22"/>
+        </w:rPr>
+      </w:pPr>
+      <w:r>
+        <w:rPr>
+          <w:rFonts w:ascii="Times New Roman" w:hAnsi="Times New Roman" w:cs="Times New Roman"/>
+          <w:sz w:val="22"/>
+          <w:szCs w:val="22"/>
+        </w:rPr>
+        <w:t>Delhi</w:t>
+      </w:r>
+      <w:r>
+        <w:rPr>
+          <w:rFonts w:ascii="Times New Roman" w:hAnsi="Times New Roman" w:cs="Times New Roman"/>
+          <w:sz w:val="22"/>
+          <w:szCs w:val="22"/>
+        </w:rPr>
+        <w:t xml:space="preserve">, India </w:t>
+      </w:r>
+      <w:r>
+        <w:rPr>
+          <w:rFonts w:ascii="Times New Roman" w:hAnsi="Times New Roman" w:cs="Times New Roman"/>
+          <w:sz w:val="22"/>
+          <w:szCs w:val="22"/>
+        </w:rPr>
+        <w:t xml:space="preserve">| </w:t>
+      </w:r>
+      <w:r>
+        <w:rPr>
+          <w:rFonts w:ascii="Times New Roman" w:hAnsi="Times New Roman" w:cs="Times New Roman"/>
+          <w:sz w:val="22"/>
+          <w:szCs w:val="22"/>
+        </w:rPr>
+        <w:t>Open to Relocation</w:t>
+      </w:r>
+      <w:r>
+        <w:rPr>
+          <w:rFonts w:ascii="Times New Roman" w:hAnsi="Times New Roman" w:cs="Times New Roman"/>
+          <w:sz w:val="22"/>
+          <w:szCs w:val="22"/>
+        </w:rPr>
+        <w:t xml:space="preserve"> | +</w:t>
+      </w:r>
+      <w:r>
+        <w:rPr>
+          <w:rFonts w:ascii="Times New Roman" w:hAnsi="Times New Roman" w:cs="Times New Roman"/>
+          <w:sz w:val="22"/>
+          <w:szCs w:val="22"/>
+        </w:rPr>
+        <w:t>91 8929402435</w:t>
+      </w:r>
+      <w:r>
+        <w:rPr>
+          <w:rFonts w:ascii="Times New Roman" w:hAnsi="Times New Roman" w:cs="Times New Roman"/>
+          <w:sz w:val="22"/>
+          <w:szCs w:val="22"/>
+        </w:rPr>
+        <w:t xml:space="preserve"> | P</w:t>
+      </w:r>
+      <w:r>
+        <w:rPr>
+          <w:rFonts w:ascii="Times New Roman" w:hAnsi="Times New Roman" w:cs="Times New Roman"/>
+          <w:sz w:val="22"/>
+          <w:szCs w:val="22"/>
+        </w:rPr>
+        <w:t>ankajgupta403104@gmail.com</w:t>
+      </w:r>
+      <w:r>
+        <w:rPr>
+          <w:rFonts w:ascii="Times New Roman" w:hAnsi="Times New Roman" w:cs="Times New Roman"/>
           <w:sz w:val="22"/>
           <w:szCs w:val="22"/>
         </w:rPr>
         <w:br/>
-        <w:t>Phone: +91 8929402435</w:t>
-      </w:r>
-      <w:r>
-        <w:rPr>
-          <w:sz w:val="22"/>
-          <w:szCs w:val="22"/>
-        </w:rPr>
-        <w:br/>
-        <w:t>Email: pankajgupta403104@gmail.com</w:t>
-      </w:r>
-      <w:r>
-        <w:rPr>
-          <w:sz w:val="22"/>
-          <w:szCs w:val="22"/>
-        </w:rPr>
-        <w:br/>
-        <w:t>LinkedIn: linkedin.com/in/pankaj-gupta-software-developer</w:t>
+        <w:t xml:space="preserve">LinkedIn: </w:t>
+      </w:r>
+      <w:r>
+        <w:rPr>
+          <w:rFonts w:ascii="Times New Roman" w:hAnsi="Times New Roman" w:cs="Times New Roman"/>
+          <w:sz w:val="22"/>
+          <w:szCs w:val="22"/>
+        </w:rPr>
+        <w:t>www.</w:t>
+      </w:r>
+      <w:r>
+        <w:rPr>
+          <w:rFonts w:ascii="Times New Roman" w:hAnsi="Times New Roman" w:cs="Times New Roman"/>
+          <w:sz w:val="22"/>
+          <w:szCs w:val="22"/>
+        </w:rPr>
+        <w:t>linkedin.com/in/pankaj-gupta-software-developer</w:t>
       </w:r>
     </w:p>
     <w:p>
       <w:pPr>
+        <w:spacing w:after="0"/>
         <w:ind w:left="-454" w:right="-454"/>
         <w:rPr>
-          <w:sz w:val="22"/>
-          <w:szCs w:val="22"/>
-        </w:rPr>
-      </w:pPr>
-      <w:r>
-        <w:rPr>
-          <w:sz w:val="22"/>
-          <w:szCs w:val="22"/>
-        </w:rPr>
-        <w:pict w14:anchorId="526FC3BB">
-          <v:rect id="_x0000_i1025" style="width:0;height:1.5pt" o:hralign="center" o:hrstd="t" o:hr="t" fillcolor="#a0a0a0" stroked="f"/>
-        </w:pict>
+          <w:rFonts w:ascii="Times New Roman" w:hAnsi="Times New Roman" w:cs="Times New Roman"/>
+          <w:sz w:val="22"/>
+          <w:szCs w:val="22"/>
+        </w:rPr>
+      </w:pPr>
+      <w:r>
+        <w:rPr>
+          <w:rFonts w:ascii="Times New Roman" w:hAnsi="Times New Roman" w:cs="Times New Roman"/>
+          <w:sz w:val="22"/>
+          <w:szCs w:val="22"/>
+        </w:rPr>
+        <w:t>Portfolio: https://pankajgupta70.github.io/Profile</w:t>
       </w:r>
     </w:p>
     <w:p>
       <w:pPr>
+        <w:spacing w:after="0"/>
+        <w:ind w:left="-454" w:right="-454"/>
+        <w:rPr>
+          <w:rFonts w:ascii="Times New Roman" w:hAnsi="Times New Roman" w:cs="Times New Roman"/>
+        </w:rPr>
+      </w:pPr>
+    </w:p>
+    <w:p>
+      <w:pPr>
         <w:spacing w:after="60"/>
         <w:ind w:left="-454" w:right="-454"/>
         <w:rPr>
-          <w:b/>
-          <w:bCs/>
-          <w:color w:val="4472C4" w:themeColor="accent1"/>
-          <w:sz w:val="22"/>
-          <w:szCs w:val="22"/>
-        </w:rPr>
-      </w:pPr>
-      <w:r>
-        <w:rPr>
-          <w:b/>
-          <w:bCs/>
-          <w:color w:val="4472C4" w:themeColor="accent1"/>
-          <w:sz w:val="22"/>
-          <w:szCs w:val="22"/>
+          <w:rFonts w:ascii="Times New Roman" w:hAnsi="Times New Roman" w:cs="Times New Roman"/>
+          <w:b/>
+          <w:bCs/>
+          <w:color w:val="000000" w:themeColor="text1"/>
+          <w:sz w:val="26"/>
+          <w:szCs w:val="26"/>
+        </w:rPr>
+      </w:pPr>
+      <w:r>
+        <w:rPr>
+          <w:rFonts w:ascii="Times New Roman" w:hAnsi="Times New Roman" w:cs="Times New Roman"/>
+          <w:b/>
+          <w:bCs/>
+          <w:color w:val="000000" w:themeColor="text1"/>
+          <w:sz w:val="26"/>
+          <w:szCs w:val="26"/>
         </w:rPr>
         <w:t>PROFESSIONAL SUMMARY</w:t>
       </w:r>
@@ -138,19 +226,22 @@
         <w:spacing w:after="0"/>
         <w:ind w:left="-454" w:right="-454"/>
         <w:rPr>
-          <w:sz w:val="22"/>
-          <w:szCs w:val="22"/>
-        </w:rPr>
-      </w:pPr>
-      <w:r>
-        <w:rPr>
-          <w:sz w:val="22"/>
-          <w:szCs w:val="22"/>
-        </w:rPr>
-        <w:t>Senior Angular Frontend Developer</w:t>
-      </w:r>
-      <w:r>
-        <w:rPr>
+          <w:rFonts w:ascii="Times New Roman" w:hAnsi="Times New Roman" w:cs="Times New Roman"/>
+          <w:sz w:val="22"/>
+          <w:szCs w:val="22"/>
+        </w:rPr>
+      </w:pPr>
+      <w:r>
+        <w:rPr>
+          <w:rFonts w:ascii="Times New Roman" w:hAnsi="Times New Roman" w:cs="Times New Roman"/>
+          <w:sz w:val="22"/>
+          <w:szCs w:val="22"/>
+        </w:rPr>
+        <w:t>Senior Angular Frontend Developer with 5 years of experience designing and delivering high-performance, scalable single-page applications (SPAs) using Angular (v2–18+), TypeScript, and modern frontend architectures. Strong expertise in performance optimization, micro frontends, accessibility (WCAG 2.1), secure frontend development, and state management (NgRx). Experienced in leading Angular modernization</w:t>
+      </w:r>
+      <w:r>
+        <w:rPr>
+          <w:rFonts w:ascii="Times New Roman" w:hAnsi="Times New Roman" w:cs="Times New Roman"/>
           <w:sz w:val="22"/>
           <w:szCs w:val="22"/>
         </w:rPr>
@@ -158,184 +249,94 @@
       </w:r>
       <w:r>
         <w:rPr>
-          <w:sz w:val="22"/>
-          <w:szCs w:val="22"/>
-        </w:rPr>
-        <w:t xml:space="preserve">with </w:t>
-      </w:r>
-      <w:r>
-        <w:rPr>
-          <w:b/>
-          <w:bCs/>
-          <w:sz w:val="22"/>
-          <w:szCs w:val="22"/>
-        </w:rPr>
-        <w:t>4+ years of experience</w:t>
-      </w:r>
-      <w:r>
-        <w:rPr>
-          <w:sz w:val="22"/>
-          <w:szCs w:val="22"/>
-        </w:rPr>
-        <w:t xml:space="preserve"> building </w:t>
-      </w:r>
-      <w:r>
-        <w:rPr>
-          <w:b/>
-          <w:bCs/>
-          <w:sz w:val="22"/>
-          <w:szCs w:val="22"/>
-        </w:rPr>
-        <w:t>high-performance, scalable Single Page Applications (SPAs)</w:t>
-      </w:r>
-      <w:r>
-        <w:rPr>
-          <w:sz w:val="22"/>
-          <w:szCs w:val="22"/>
-        </w:rPr>
-        <w:t xml:space="preserve"> using </w:t>
-      </w:r>
-      <w:r>
-        <w:rPr>
-          <w:b/>
-          <w:bCs/>
-          <w:sz w:val="22"/>
-          <w:szCs w:val="22"/>
-        </w:rPr>
-        <w:t>Angular (v2–18+)</w:t>
-      </w:r>
-      <w:r>
-        <w:rPr>
-          <w:sz w:val="22"/>
-          <w:szCs w:val="22"/>
-        </w:rPr>
-        <w:t>, TypeScript, and modern frontend architectures</w:t>
-      </w:r>
-      <w:r>
-        <w:rPr>
-          <w:sz w:val="22"/>
-          <w:szCs w:val="22"/>
-        </w:rPr>
-        <w:t xml:space="preserve"> </w:t>
-      </w:r>
-      <w:r>
-        <w:rPr>
-          <w:b/>
-          <w:bCs/>
-          <w:sz w:val="22"/>
-          <w:szCs w:val="22"/>
-        </w:rPr>
-        <w:t>for enterprise-scale frontend systems</w:t>
-      </w:r>
-      <w:r>
-        <w:rPr>
-          <w:sz w:val="22"/>
-          <w:szCs w:val="22"/>
-        </w:rPr>
-        <w:t xml:space="preserve">. Proven expertise in </w:t>
-      </w:r>
-      <w:r>
-        <w:rPr>
-          <w:b/>
-          <w:bCs/>
-          <w:sz w:val="22"/>
-          <w:szCs w:val="22"/>
-        </w:rPr>
-        <w:t>performance optimization, micro frontends, accessibility (WCAG 2.1)</w:t>
-      </w:r>
-      <w:r>
-        <w:rPr>
-          <w:sz w:val="22"/>
-          <w:szCs w:val="22"/>
-        </w:rPr>
-        <w:t xml:space="preserve">, and </w:t>
-      </w:r>
-      <w:r>
-        <w:rPr>
-          <w:b/>
-          <w:bCs/>
-          <w:sz w:val="22"/>
-          <w:szCs w:val="22"/>
-        </w:rPr>
-        <w:t>state management (NgRx)</w:t>
-      </w:r>
-      <w:r>
-        <w:rPr>
-          <w:sz w:val="22"/>
-          <w:szCs w:val="22"/>
-        </w:rPr>
-        <w:t xml:space="preserve">. Delivered </w:t>
-      </w:r>
-      <w:r>
-        <w:rPr>
-          <w:b/>
-          <w:bCs/>
-          <w:sz w:val="22"/>
-          <w:szCs w:val="22"/>
-        </w:rPr>
-        <w:t>enterprise and government platforms adopted across 140+ countries</w:t>
-      </w:r>
-      <w:r>
-        <w:rPr>
-          <w:sz w:val="22"/>
-          <w:szCs w:val="22"/>
-        </w:rPr>
-        <w:t xml:space="preserve">, supporting </w:t>
-      </w:r>
-      <w:r>
-        <w:rPr>
-          <w:b/>
-          <w:bCs/>
-          <w:sz w:val="22"/>
-          <w:szCs w:val="22"/>
-        </w:rPr>
-        <w:t>2,000+ concurrent users</w:t>
-      </w:r>
-      <w:r>
-        <w:rPr>
-          <w:sz w:val="22"/>
-          <w:szCs w:val="22"/>
-        </w:rPr>
-        <w:t xml:space="preserve"> in secure, mission-critical environments.</w:t>
+          <w:rFonts w:ascii="Times New Roman" w:hAnsi="Times New Roman" w:cs="Times New Roman"/>
+          <w:sz w:val="22"/>
+          <w:szCs w:val="22"/>
+        </w:rPr>
+        <w:t>initiatives</w:t>
+      </w:r>
+      <w:r>
+        <w:t xml:space="preserve">, </w:t>
+      </w:r>
+      <w:r>
+        <w:rPr>
+          <w:rFonts w:ascii="Times New Roman" w:hAnsi="Times New Roman" w:cs="Times New Roman"/>
+          <w:sz w:val="22"/>
+          <w:szCs w:val="22"/>
+        </w:rPr>
+        <w:t>driving frontend</w:t>
+      </w:r>
+      <w:r>
+        <w:rPr>
+          <w:rFonts w:ascii="Times New Roman" w:hAnsi="Times New Roman" w:cs="Times New Roman"/>
+          <w:sz w:val="22"/>
+          <w:szCs w:val="22"/>
+        </w:rPr>
+        <w:t xml:space="preserve"> architecture decisions, and mentoring junior </w:t>
+      </w:r>
+      <w:r>
+        <w:rPr>
+          <w:rFonts w:ascii="Times New Roman" w:hAnsi="Times New Roman" w:cs="Times New Roman"/>
+          <w:sz w:val="22"/>
+          <w:szCs w:val="22"/>
+        </w:rPr>
+        <w:t>engineers</w:t>
+      </w:r>
+      <w:r>
+        <w:rPr>
+          <w:rFonts w:ascii="Times New Roman" w:hAnsi="Times New Roman" w:cs="Times New Roman"/>
+          <w:sz w:val="22"/>
+          <w:szCs w:val="22"/>
+        </w:rPr>
+        <w:t xml:space="preserve">. Delivered enterprise and government-grade platforms adopted across 140+ countries, supporting 2,000+ concurrent users in secure, mission-critical </w:t>
+      </w:r>
+      <w:r>
+        <w:rPr>
+          <w:rFonts w:ascii="Times New Roman" w:hAnsi="Times New Roman" w:cs="Times New Roman"/>
+          <w:sz w:val="22"/>
+          <w:szCs w:val="22"/>
+        </w:rPr>
+        <w:t xml:space="preserve">enterprise </w:t>
+      </w:r>
+      <w:r>
+        <w:rPr>
+          <w:rFonts w:ascii="Times New Roman" w:hAnsi="Times New Roman" w:cs="Times New Roman"/>
+          <w:sz w:val="22"/>
+          <w:szCs w:val="22"/>
+        </w:rPr>
+        <w:t>environments.</w:t>
       </w:r>
     </w:p>
     <w:p>
       <w:pPr>
-        <w:ind w:left="-454" w:right="-454"/>
-        <w:rPr>
-          <w:sz w:val="22"/>
-          <w:szCs w:val="22"/>
-        </w:rPr>
-      </w:pPr>
-      <w:r>
-        <w:rPr>
-          <w:sz w:val="22"/>
-          <w:szCs w:val="22"/>
-        </w:rPr>
-        <w:pict w14:anchorId="24B4AE4F">
-          <v:rect id="_x0000_i1026" style="width:0;height:1.5pt" o:hralign="center" o:hrstd="t" o:hr="t" fillcolor="#a0a0a0" stroked="f"/>
-        </w:pict>
-      </w:r>
+        <w:spacing w:after="0"/>
+        <w:ind w:right="-454"/>
+        <w:rPr>
+          <w:rFonts w:ascii="Times New Roman" w:hAnsi="Times New Roman" w:cs="Times New Roman"/>
+        </w:rPr>
+      </w:pPr>
     </w:p>
     <w:p>
       <w:pPr>
         <w:spacing w:after="60"/>
         <w:ind w:left="-454" w:right="-454"/>
         <w:rPr>
-          <w:b/>
-          <w:bCs/>
-          <w:color w:val="4472C4" w:themeColor="accent1"/>
-          <w:sz w:val="22"/>
-          <w:szCs w:val="22"/>
-        </w:rPr>
-      </w:pPr>
-      <w:r>
-        <w:rPr>
-          <w:b/>
-          <w:bCs/>
-          <w:color w:val="4472C4" w:themeColor="accent1"/>
-          <w:sz w:val="22"/>
-          <w:szCs w:val="22"/>
+          <w:rFonts w:ascii="Times New Roman" w:hAnsi="Times New Roman" w:cs="Times New Roman"/>
+          <w:b/>
+          <w:bCs/>
+          <w:color w:val="000000" w:themeColor="text1"/>
+          <w:sz w:val="26"/>
+          <w:szCs w:val="26"/>
+        </w:rPr>
+      </w:pPr>
+      <w:r>
+        <w:rPr>
+          <w:rFonts w:ascii="Times New Roman" w:hAnsi="Times New Roman" w:cs="Times New Roman"/>
+          <w:b/>
+          <w:bCs/>
+          <w:color w:val="000000" w:themeColor="text1"/>
+          <w:sz w:val="26"/>
+          <w:szCs w:val="26"/>
         </w:rPr>
         <w:t>CORE SKILLS</w:t>
       </w:r>
@@ -347,28 +348,30 @@
           <w:ilvl w:val="0"/>
           <w:numId w:val="11"/>
         </w:numPr>
-        <w:spacing w:after="0"/>
         <w:ind w:right="-454"/>
         <w:rPr>
-          <w:sz w:val="22"/>
-          <w:szCs w:val="22"/>
-        </w:rPr>
-      </w:pPr>
-      <w:r>
-        <w:rPr>
-          <w:b/>
-          <w:bCs/>
-          <w:sz w:val="22"/>
-          <w:szCs w:val="22"/>
-        </w:rPr>
-        <w:t>Frontend Development:</w:t>
-      </w:r>
-      <w:r>
-        <w:rPr>
-          <w:sz w:val="22"/>
-          <w:szCs w:val="22"/>
-        </w:rPr>
-        <w:t xml:space="preserve"> Angular-based UI Engineering, Component-Driven Development</w:t>
+          <w:rFonts w:ascii="Times New Roman" w:hAnsi="Times New Roman" w:cs="Times New Roman"/>
+          <w:sz w:val="22"/>
+          <w:szCs w:val="22"/>
+        </w:rPr>
+      </w:pPr>
+      <w:r>
+        <w:rPr>
+          <w:rFonts w:ascii="Times New Roman" w:hAnsi="Times New Roman" w:cs="Times New Roman"/>
+          <w:b/>
+          <w:bCs/>
+          <w:sz w:val="22"/>
+          <w:szCs w:val="22"/>
+        </w:rPr>
+        <w:t>Framework &amp; Library:</w:t>
+      </w:r>
+      <w:r>
+        <w:rPr>
+          <w:rFonts w:ascii="Times New Roman" w:hAnsi="Times New Roman" w:cs="Times New Roman"/>
+          <w:sz w:val="22"/>
+          <w:szCs w:val="22"/>
+        </w:rPr>
+        <w:t xml:space="preserve"> Angular (v2–18+), Angular CLI, Angular Material, JSON, jQuery</w:t>
       </w:r>
     </w:p>
     <w:p>
@@ -378,49 +381,30 @@
           <w:ilvl w:val="0"/>
           <w:numId w:val="11"/>
         </w:numPr>
-        <w:spacing w:after="0"/>
         <w:ind w:right="-454"/>
         <w:rPr>
-          <w:sz w:val="22"/>
-          <w:szCs w:val="22"/>
-        </w:rPr>
-      </w:pPr>
-      <w:r>
-        <w:rPr>
-          <w:b/>
-          <w:bCs/>
-          <w:sz w:val="22"/>
-          <w:szCs w:val="22"/>
-        </w:rPr>
-        <w:t>Frontend:</w:t>
-      </w:r>
-      <w:r>
-        <w:rPr>
-          <w:sz w:val="22"/>
-          <w:szCs w:val="22"/>
-        </w:rPr>
-        <w:t xml:space="preserve"> Angular (v2–18+), Angular CLI, Angular Material, Signals, RxJS, NgRx, NgXS</w:t>
-      </w:r>
-      <w:r>
-        <w:rPr>
-          <w:sz w:val="22"/>
-          <w:szCs w:val="22"/>
-        </w:rPr>
-        <w:t>, JSON</w:t>
-      </w:r>
-      <w:r>
-        <w:rPr>
-          <w:sz w:val="22"/>
-          <w:szCs w:val="22"/>
-        </w:rPr>
-        <w:t>,</w:t>
-      </w:r>
-      <w:r>
-        <w:rPr>
-          <w:sz w:val="22"/>
-          <w:szCs w:val="22"/>
-        </w:rPr>
-        <w:t xml:space="preserve"> jQuery</w:t>
+          <w:rFonts w:ascii="Times New Roman" w:hAnsi="Times New Roman" w:cs="Times New Roman"/>
+          <w:sz w:val="22"/>
+          <w:szCs w:val="22"/>
+        </w:rPr>
+      </w:pPr>
+      <w:r>
+        <w:rPr>
+          <w:rFonts w:ascii="Times New Roman" w:hAnsi="Times New Roman" w:cs="Times New Roman"/>
+          <w:b/>
+          <w:bCs/>
+          <w:sz w:val="22"/>
+          <w:szCs w:val="22"/>
+        </w:rPr>
+        <w:t>State Management:</w:t>
+      </w:r>
+      <w:r>
+        <w:rPr>
+          <w:rFonts w:ascii="Times New Roman" w:hAnsi="Times New Roman" w:cs="Times New Roman"/>
+          <w:sz w:val="22"/>
+          <w:szCs w:val="22"/>
+        </w:rPr>
+        <w:t xml:space="preserve"> NgRx, NgXS, RxJS, Signals</w:t>
       </w:r>
     </w:p>
     <w:p>
@@ -430,28 +414,30 @@
           <w:ilvl w:val="0"/>
           <w:numId w:val="11"/>
         </w:numPr>
-        <w:spacing w:after="0"/>
         <w:ind w:right="-454"/>
         <w:rPr>
-          <w:sz w:val="22"/>
-          <w:szCs w:val="22"/>
-        </w:rPr>
-      </w:pPr>
-      <w:r>
-        <w:rPr>
-          <w:b/>
-          <w:bCs/>
-          <w:sz w:val="22"/>
-          <w:szCs w:val="22"/>
-        </w:rPr>
-        <w:t xml:space="preserve">Angular Core Concepts: </w:t>
-      </w:r>
-      <w:r>
-        <w:rPr>
-          <w:sz w:val="22"/>
-          <w:szCs w:val="22"/>
-        </w:rPr>
-        <w:t>Component Lifecycle, Change Detection, Component Architecture</w:t>
+          <w:rFonts w:ascii="Times New Roman" w:hAnsi="Times New Roman" w:cs="Times New Roman"/>
+          <w:sz w:val="22"/>
+          <w:szCs w:val="22"/>
+        </w:rPr>
+      </w:pPr>
+      <w:r>
+        <w:rPr>
+          <w:rFonts w:ascii="Times New Roman" w:hAnsi="Times New Roman" w:cs="Times New Roman"/>
+          <w:b/>
+          <w:bCs/>
+          <w:sz w:val="22"/>
+          <w:szCs w:val="22"/>
+        </w:rPr>
+        <w:t>Angular Expertise:</w:t>
+      </w:r>
+      <w:r>
+        <w:rPr>
+          <w:rFonts w:ascii="Times New Roman" w:hAnsi="Times New Roman" w:cs="Times New Roman"/>
+          <w:sz w:val="22"/>
+          <w:szCs w:val="22"/>
+        </w:rPr>
+        <w:t xml:space="preserve"> Component Lifecycle, Change Detection, Dependency Injection, Standalone Components, Reactive Forms, Angular Interceptors, Route Guards</w:t>
       </w:r>
     </w:p>
     <w:p>
@@ -461,28 +447,30 @@
           <w:ilvl w:val="0"/>
           <w:numId w:val="11"/>
         </w:numPr>
-        <w:spacing w:after="0"/>
         <w:ind w:right="-454"/>
         <w:rPr>
-          <w:sz w:val="22"/>
-          <w:szCs w:val="22"/>
-        </w:rPr>
-      </w:pPr>
-      <w:r>
-        <w:rPr>
-          <w:b/>
-          <w:bCs/>
-          <w:sz w:val="22"/>
-          <w:szCs w:val="22"/>
-        </w:rPr>
-        <w:t>Forms &amp; Data Handling:</w:t>
-      </w:r>
-      <w:r>
-        <w:rPr>
-          <w:sz w:val="22"/>
-          <w:szCs w:val="22"/>
-        </w:rPr>
-        <w:t xml:space="preserve"> Angular Forms, Reactive Forms</w:t>
+          <w:rFonts w:ascii="Times New Roman" w:hAnsi="Times New Roman" w:cs="Times New Roman"/>
+          <w:sz w:val="22"/>
+          <w:szCs w:val="22"/>
+        </w:rPr>
+      </w:pPr>
+      <w:r>
+        <w:rPr>
+          <w:rFonts w:ascii="Times New Roman" w:hAnsi="Times New Roman" w:cs="Times New Roman"/>
+          <w:b/>
+          <w:bCs/>
+          <w:sz w:val="22"/>
+          <w:szCs w:val="22"/>
+        </w:rPr>
+        <w:t>Languages:</w:t>
+      </w:r>
+      <w:r>
+        <w:rPr>
+          <w:rFonts w:ascii="Times New Roman" w:hAnsi="Times New Roman" w:cs="Times New Roman"/>
+          <w:sz w:val="22"/>
+          <w:szCs w:val="22"/>
+        </w:rPr>
+        <w:t xml:space="preserve"> TypeScript, JavaScript (ES6+), HTML5, CSS3, SCSS, SASS</w:t>
       </w:r>
     </w:p>
     <w:p>
@@ -492,28 +480,30 @@
           <w:ilvl w:val="0"/>
           <w:numId w:val="11"/>
         </w:numPr>
-        <w:spacing w:after="0"/>
         <w:ind w:right="-454"/>
         <w:rPr>
-          <w:sz w:val="22"/>
-          <w:szCs w:val="22"/>
-        </w:rPr>
-      </w:pPr>
-      <w:r>
-        <w:rPr>
-          <w:b/>
-          <w:bCs/>
-          <w:sz w:val="22"/>
-          <w:szCs w:val="22"/>
-        </w:rPr>
-        <w:t>Languages:</w:t>
-      </w:r>
-      <w:r>
-        <w:rPr>
-          <w:sz w:val="22"/>
-          <w:szCs w:val="22"/>
-        </w:rPr>
-        <w:t xml:space="preserve"> TypeScript, JavaScript (ES6+), HTML5, CSS3, SASS, SCSS</w:t>
+          <w:rFonts w:ascii="Times New Roman" w:hAnsi="Times New Roman" w:cs="Times New Roman"/>
+          <w:sz w:val="22"/>
+          <w:szCs w:val="22"/>
+        </w:rPr>
+      </w:pPr>
+      <w:r>
+        <w:rPr>
+          <w:rFonts w:ascii="Times New Roman" w:hAnsi="Times New Roman" w:cs="Times New Roman"/>
+          <w:b/>
+          <w:bCs/>
+          <w:sz w:val="22"/>
+          <w:szCs w:val="22"/>
+        </w:rPr>
+        <w:t>Architecture:</w:t>
+      </w:r>
+      <w:r>
+        <w:rPr>
+          <w:rFonts w:ascii="Times New Roman" w:hAnsi="Times New Roman" w:cs="Times New Roman"/>
+          <w:sz w:val="22"/>
+          <w:szCs w:val="22"/>
+        </w:rPr>
+        <w:t xml:space="preserve"> SPA, Modular Architecture, Lazy Loading, Micro Frontends (Module Federation)</w:t>
       </w:r>
     </w:p>
     <w:p>
@@ -523,28 +513,30 @@
           <w:ilvl w:val="0"/>
           <w:numId w:val="11"/>
         </w:numPr>
-        <w:spacing w:after="0"/>
         <w:ind w:right="-454"/>
         <w:rPr>
-          <w:sz w:val="22"/>
-          <w:szCs w:val="22"/>
-        </w:rPr>
-      </w:pPr>
-      <w:r>
-        <w:rPr>
-          <w:b/>
-          <w:bCs/>
-          <w:sz w:val="22"/>
-          <w:szCs w:val="22"/>
-        </w:rPr>
-        <w:t>Architecture:</w:t>
-      </w:r>
-      <w:r>
-        <w:rPr>
-          <w:sz w:val="22"/>
-          <w:szCs w:val="22"/>
-        </w:rPr>
-        <w:t xml:space="preserve"> SPA, Modular Architecture, Lazy Loading, Micro Frontends</w:t>
+          <w:rFonts w:ascii="Times New Roman" w:hAnsi="Times New Roman" w:cs="Times New Roman"/>
+          <w:sz w:val="22"/>
+          <w:szCs w:val="22"/>
+        </w:rPr>
+      </w:pPr>
+      <w:r>
+        <w:rPr>
+          <w:rFonts w:ascii="Times New Roman" w:hAnsi="Times New Roman" w:cs="Times New Roman"/>
+          <w:b/>
+          <w:bCs/>
+          <w:sz w:val="22"/>
+          <w:szCs w:val="22"/>
+        </w:rPr>
+        <w:t>Performance Optimization:</w:t>
+      </w:r>
+      <w:r>
+        <w:rPr>
+          <w:rFonts w:ascii="Times New Roman" w:hAnsi="Times New Roman" w:cs="Times New Roman"/>
+          <w:sz w:val="22"/>
+          <w:szCs w:val="22"/>
+        </w:rPr>
+        <w:t xml:space="preserve"> Webpack Optimization, Bundle Reduction, Change Detection Strategy (OnPush), Performance Profiling (Chrome DevTools), Memory Leak Detection</w:t>
       </w:r>
     </w:p>
     <w:p>
@@ -554,28 +546,30 @@
           <w:ilvl w:val="0"/>
           <w:numId w:val="11"/>
         </w:numPr>
-        <w:spacing w:after="0"/>
         <w:ind w:right="-454"/>
         <w:rPr>
-          <w:sz w:val="22"/>
-          <w:szCs w:val="22"/>
-        </w:rPr>
-      </w:pPr>
-      <w:r>
-        <w:rPr>
-          <w:b/>
-          <w:bCs/>
-          <w:sz w:val="22"/>
-          <w:szCs w:val="22"/>
-        </w:rPr>
-        <w:t>Performance:</w:t>
-      </w:r>
-      <w:r>
-        <w:rPr>
-          <w:sz w:val="22"/>
-          <w:szCs w:val="22"/>
-        </w:rPr>
-        <w:t xml:space="preserve"> Webpack Optimization, Bundle Reduction, Change Detection Strategy</w:t>
+          <w:rFonts w:ascii="Times New Roman" w:hAnsi="Times New Roman" w:cs="Times New Roman"/>
+          <w:sz w:val="22"/>
+          <w:szCs w:val="22"/>
+        </w:rPr>
+      </w:pPr>
+      <w:r>
+        <w:rPr>
+          <w:rFonts w:ascii="Times New Roman" w:hAnsi="Times New Roman" w:cs="Times New Roman"/>
+          <w:b/>
+          <w:bCs/>
+          <w:sz w:val="22"/>
+          <w:szCs w:val="22"/>
+        </w:rPr>
+        <w:t>UI/UX &amp; Accessibility:</w:t>
+      </w:r>
+      <w:r>
+        <w:rPr>
+          <w:rFonts w:ascii="Times New Roman" w:hAnsi="Times New Roman" w:cs="Times New Roman"/>
+          <w:sz w:val="22"/>
+          <w:szCs w:val="22"/>
+        </w:rPr>
+        <w:t xml:space="preserve"> Responsive Design, Cross-Browser Compatibility, WCAG 2.1, i18n/L10n, RTL</w:t>
       </w:r>
     </w:p>
     <w:p>
@@ -585,28 +579,30 @@
           <w:ilvl w:val="0"/>
           <w:numId w:val="11"/>
         </w:numPr>
-        <w:spacing w:after="0"/>
         <w:ind w:right="-454"/>
         <w:rPr>
-          <w:sz w:val="22"/>
-          <w:szCs w:val="22"/>
-        </w:rPr>
-      </w:pPr>
-      <w:r>
-        <w:rPr>
-          <w:b/>
-          <w:bCs/>
-          <w:sz w:val="22"/>
-          <w:szCs w:val="22"/>
-        </w:rPr>
-        <w:t>UI/UX &amp; Accessibility:</w:t>
-      </w:r>
-      <w:r>
-        <w:rPr>
-          <w:sz w:val="22"/>
-          <w:szCs w:val="22"/>
-        </w:rPr>
-        <w:t xml:space="preserve"> Responsive Design, Cross-Browser Compatibility, WCAG 2.1, i18n/L10n, RTL</w:t>
+          <w:rFonts w:ascii="Times New Roman" w:hAnsi="Times New Roman" w:cs="Times New Roman"/>
+          <w:sz w:val="22"/>
+          <w:szCs w:val="22"/>
+        </w:rPr>
+      </w:pPr>
+      <w:r>
+        <w:rPr>
+          <w:rFonts w:ascii="Times New Roman" w:hAnsi="Times New Roman" w:cs="Times New Roman"/>
+          <w:b/>
+          <w:bCs/>
+          <w:sz w:val="22"/>
+          <w:szCs w:val="22"/>
+        </w:rPr>
+        <w:t>Testing &amp; Tools:</w:t>
+      </w:r>
+      <w:r>
+        <w:rPr>
+          <w:rFonts w:ascii="Times New Roman" w:hAnsi="Times New Roman" w:cs="Times New Roman"/>
+          <w:sz w:val="22"/>
+          <w:szCs w:val="22"/>
+        </w:rPr>
+        <w:t xml:space="preserve"> Jest, Jasmine (working knowledge), Git, GitHub, Postman, NPM</w:t>
       </w:r>
     </w:p>
     <w:p>
@@ -616,28 +612,30 @@
           <w:ilvl w:val="0"/>
           <w:numId w:val="11"/>
         </w:numPr>
-        <w:spacing w:after="0"/>
         <w:ind w:right="-454"/>
         <w:rPr>
-          <w:sz w:val="22"/>
-          <w:szCs w:val="22"/>
-        </w:rPr>
-      </w:pPr>
-      <w:r>
-        <w:rPr>
-          <w:b/>
-          <w:bCs/>
-          <w:sz w:val="22"/>
-          <w:szCs w:val="22"/>
-        </w:rPr>
-        <w:t>Testing &amp; Tools:</w:t>
-      </w:r>
-      <w:r>
-        <w:rPr>
-          <w:sz w:val="22"/>
-          <w:szCs w:val="22"/>
-        </w:rPr>
-        <w:t xml:space="preserve"> Jest, Jasmine (working knowledge), Git, GitHub, Postman, NPM</w:t>
+          <w:rFonts w:ascii="Times New Roman" w:hAnsi="Times New Roman" w:cs="Times New Roman"/>
+          <w:sz w:val="22"/>
+          <w:szCs w:val="22"/>
+        </w:rPr>
+      </w:pPr>
+      <w:r>
+        <w:rPr>
+          <w:rFonts w:ascii="Times New Roman" w:hAnsi="Times New Roman" w:cs="Times New Roman"/>
+          <w:b/>
+          <w:bCs/>
+          <w:sz w:val="22"/>
+          <w:szCs w:val="22"/>
+        </w:rPr>
+        <w:t>Frontend Integration:</w:t>
+      </w:r>
+      <w:r>
+        <w:rPr>
+          <w:rFonts w:ascii="Times New Roman" w:hAnsi="Times New Roman" w:cs="Times New Roman"/>
+          <w:sz w:val="22"/>
+          <w:szCs w:val="22"/>
+        </w:rPr>
+        <w:t xml:space="preserve"> RESTful API Integration using RxJS</w:t>
       </w:r>
     </w:p>
     <w:p>
@@ -647,28 +645,142 @@
           <w:ilvl w:val="0"/>
           <w:numId w:val="11"/>
         </w:numPr>
+        <w:ind w:right="-454"/>
+        <w:rPr>
+          <w:rFonts w:ascii="Times New Roman" w:hAnsi="Times New Roman" w:cs="Times New Roman"/>
+          <w:sz w:val="22"/>
+          <w:szCs w:val="22"/>
+        </w:rPr>
+      </w:pPr>
+      <w:r>
+        <w:rPr>
+          <w:rFonts w:ascii="Times New Roman" w:hAnsi="Times New Roman" w:cs="Times New Roman"/>
+          <w:b/>
+          <w:bCs/>
+          <w:sz w:val="22"/>
+          <w:szCs w:val="22"/>
+        </w:rPr>
+        <w:t>Methodologies:</w:t>
+      </w:r>
+      <w:r>
+        <w:rPr>
+          <w:rFonts w:ascii="Times New Roman" w:hAnsi="Times New Roman" w:cs="Times New Roman"/>
+          <w:sz w:val="22"/>
+          <w:szCs w:val="22"/>
+        </w:rPr>
+        <w:t xml:space="preserve"> Agile/Scrum, Code Reviews</w:t>
+      </w:r>
+    </w:p>
+    <w:p>
+      <w:pPr>
+        <w:pStyle w:val="ListParagraph"/>
         <w:spacing w:after="0"/>
-        <w:ind w:right="-454"/>
-        <w:rPr>
-          <w:sz w:val="22"/>
-          <w:szCs w:val="22"/>
-        </w:rPr>
-      </w:pPr>
-      <w:r>
-        <w:rPr>
-          <w:b/>
-          <w:bCs/>
-          <w:sz w:val="22"/>
-          <w:szCs w:val="22"/>
-        </w:rPr>
-        <w:t>Frontend Integration:</w:t>
-      </w:r>
-      <w:r>
-        <w:rPr>
-          <w:sz w:val="22"/>
-          <w:szCs w:val="22"/>
-        </w:rPr>
-        <w:t xml:space="preserve"> RESTful API Integration using RxJS</w:t>
+        <w:ind w:left="266" w:right="-454"/>
+        <w:rPr>
+          <w:rFonts w:ascii="Times New Roman" w:hAnsi="Times New Roman" w:cs="Times New Roman"/>
+        </w:rPr>
+      </w:pPr>
+    </w:p>
+    <w:p>
+      <w:pPr>
+        <w:spacing w:after="60"/>
+        <w:ind w:left="-454" w:right="-454"/>
+        <w:rPr>
+          <w:rFonts w:ascii="Times New Roman" w:hAnsi="Times New Roman" w:cs="Times New Roman"/>
+          <w:b/>
+          <w:bCs/>
+          <w:color w:val="000000" w:themeColor="text1"/>
+          <w:sz w:val="26"/>
+          <w:szCs w:val="26"/>
+        </w:rPr>
+      </w:pPr>
+      <w:r>
+        <w:rPr>
+          <w:rFonts w:ascii="Times New Roman" w:hAnsi="Times New Roman" w:cs="Times New Roman"/>
+          <w:b/>
+          <w:bCs/>
+          <w:color w:val="000000" w:themeColor="text1"/>
+          <w:sz w:val="26"/>
+          <w:szCs w:val="26"/>
+        </w:rPr>
+        <w:t>PROFESSIONAL EXPERIENCE</w:t>
+      </w:r>
+    </w:p>
+    <w:p>
+      <w:pPr>
+        <w:spacing w:after="0"/>
+        <w:ind w:left="-454" w:right="-454"/>
+        <w:rPr>
+          <w:rFonts w:ascii="Times New Roman" w:hAnsi="Times New Roman" w:cs="Times New Roman"/>
+          <w:sz w:val="22"/>
+          <w:szCs w:val="22"/>
+        </w:rPr>
+      </w:pPr>
+      <w:r>
+        <w:rPr>
+          <w:rFonts w:ascii="Times New Roman" w:hAnsi="Times New Roman" w:cs="Times New Roman"/>
+          <w:b/>
+          <w:bCs/>
+          <w:sz w:val="22"/>
+          <w:szCs w:val="22"/>
+        </w:rPr>
+        <w:t>Tata Consultancy Services (TCS)</w:t>
+      </w:r>
+      <w:r>
+        <w:rPr>
+          <w:rFonts w:ascii="Times New Roman" w:hAnsi="Times New Roman" w:cs="Times New Roman"/>
+          <w:sz w:val="22"/>
+          <w:szCs w:val="22"/>
+        </w:rPr>
+        <w:br/>
+      </w:r>
+      <w:r>
+        <w:rPr>
+          <w:rFonts w:ascii="Times New Roman" w:hAnsi="Times New Roman" w:cs="Times New Roman"/>
+          <w:b/>
+          <w:bCs/>
+          <w:sz w:val="22"/>
+          <w:szCs w:val="22"/>
+        </w:rPr>
+        <w:t xml:space="preserve">Software Engineer </w:t>
+      </w:r>
+      <w:r>
+        <w:rPr>
+          <w:rFonts w:ascii="Times New Roman" w:hAnsi="Times New Roman" w:cs="Times New Roman"/>
+          <w:b/>
+          <w:bCs/>
+          <w:sz w:val="22"/>
+          <w:szCs w:val="22"/>
+        </w:rPr>
+        <w:t xml:space="preserve">- </w:t>
+      </w:r>
+      <w:r>
+        <w:rPr>
+          <w:rFonts w:ascii="Times New Roman" w:hAnsi="Times New Roman" w:cs="Times New Roman"/>
+          <w:b/>
+          <w:bCs/>
+          <w:sz w:val="22"/>
+          <w:szCs w:val="22"/>
+        </w:rPr>
+        <w:t>Senior Angular Frontend Developer</w:t>
+      </w:r>
+      <w:r>
+        <w:rPr>
+          <w:rFonts w:ascii="Times New Roman" w:hAnsi="Times New Roman" w:cs="Times New Roman"/>
+          <w:sz w:val="22"/>
+          <w:szCs w:val="22"/>
+        </w:rPr>
+        <w:br/>
+      </w:r>
+      <w:r>
+        <w:rPr>
+          <w:rFonts w:ascii="Times New Roman" w:hAnsi="Times New Roman" w:cs="Times New Roman"/>
+          <w:i/>
+          <w:iCs/>
+          <w:sz w:val="22"/>
+          <w:szCs w:val="22"/>
+        </w:rPr>
+        <w:t>April 2021 – Present</w:t>
       </w:r>
     </w:p>
     <w:p>
@@ -676,139 +788,23 @@
         <w:pStyle w:val="ListParagraph"/>
         <w:numPr>
           <w:ilvl w:val="0"/>
-          <w:numId w:val="11"/>
+          <w:numId w:val="19"/>
         </w:numPr>
         <w:spacing w:after="0"/>
         <w:ind w:right="-454"/>
         <w:rPr>
-          <w:sz w:val="22"/>
-          <w:szCs w:val="22"/>
-        </w:rPr>
-      </w:pPr>
-      <w:r>
-        <w:rPr>
-          <w:b/>
-          <w:bCs/>
-          <w:sz w:val="22"/>
-          <w:szCs w:val="22"/>
-        </w:rPr>
-        <w:t>Methodologies:</w:t>
-      </w:r>
-      <w:r>
-        <w:rPr>
-          <w:sz w:val="22"/>
-          <w:szCs w:val="22"/>
-        </w:rPr>
-        <w:t xml:space="preserve"> Agile/Scrum, CI/CD Pipelines, Code Reviews</w:t>
-      </w:r>
-    </w:p>
-    <w:p>
-      <w:pPr>
-        <w:ind w:left="-454" w:right="-454"/>
-        <w:rPr>
-          <w:sz w:val="22"/>
-          <w:szCs w:val="22"/>
-        </w:rPr>
-      </w:pPr>
-      <w:r>
-        <w:rPr>
-          <w:sz w:val="22"/>
-          <w:szCs w:val="22"/>
-        </w:rPr>
-        <w:pict w14:anchorId="428FCA37">
-          <v:rect id="_x0000_i1027" style="width:0;height:1.5pt" o:hralign="center" o:hrstd="t" o:hr="t" fillcolor="#a0a0a0" stroked="f"/>
-        </w:pict>
-      </w:r>
-    </w:p>
-    <w:p>
-      <w:pPr>
-        <w:spacing w:after="60"/>
-        <w:ind w:left="-454" w:right="-454"/>
-        <w:rPr>
-          <w:b/>
-          <w:bCs/>
-          <w:color w:val="4472C4" w:themeColor="accent1"/>
-          <w:sz w:val="22"/>
-          <w:szCs w:val="22"/>
-        </w:rPr>
-      </w:pPr>
-      <w:r>
-        <w:rPr>
-          <w:b/>
-          <w:bCs/>
-          <w:color w:val="4472C4" w:themeColor="accent1"/>
-          <w:sz w:val="22"/>
-          <w:szCs w:val="22"/>
-        </w:rPr>
-        <w:t>PROFESSIONAL EXPERIENCE</w:t>
-      </w:r>
-    </w:p>
-    <w:p>
-      <w:pPr>
-        <w:ind w:left="-454" w:right="-454"/>
-        <w:rPr>
-          <w:sz w:val="22"/>
-          <w:szCs w:val="22"/>
-        </w:rPr>
-      </w:pPr>
-      <w:r>
-        <w:rPr>
-          <w:b/>
-          <w:bCs/>
-          <w:sz w:val="22"/>
-          <w:szCs w:val="22"/>
-        </w:rPr>
-        <w:t>Tata Consultancy Services (TCS)</w:t>
-      </w:r>
-      <w:r>
-        <w:rPr>
-          <w:sz w:val="22"/>
-          <w:szCs w:val="22"/>
-        </w:rPr>
-        <w:br/>
-      </w:r>
-      <w:r>
-        <w:rPr>
-          <w:b/>
-          <w:bCs/>
-          <w:sz w:val="22"/>
-          <w:szCs w:val="22"/>
-        </w:rPr>
-        <w:t xml:space="preserve">Software Engineer </w:t>
-      </w:r>
-      <w:r>
-        <w:rPr>
-          <w:b/>
-          <w:bCs/>
-          <w:sz w:val="22"/>
-          <w:szCs w:val="22"/>
-        </w:rPr>
-        <w:t xml:space="preserve">- </w:t>
-      </w:r>
-      <w:r>
-        <w:rPr>
-          <w:b/>
-          <w:bCs/>
-          <w:sz w:val="22"/>
-          <w:szCs w:val="22"/>
-        </w:rPr>
-        <w:t>Senior Angular Frontend Developer</w:t>
-      </w:r>
-      <w:r>
-        <w:rPr>
-          <w:sz w:val="22"/>
-          <w:szCs w:val="22"/>
-        </w:rPr>
-        <w:br/>
-      </w:r>
-      <w:r>
-        <w:rPr>
-          <w:i/>
-          <w:iCs/>
-          <w:sz w:val="22"/>
-          <w:szCs w:val="22"/>
-        </w:rPr>
-        <w:t>April 2021 – Present</w:t>
+          <w:rFonts w:ascii="Times New Roman" w:hAnsi="Times New Roman" w:cs="Times New Roman"/>
+          <w:sz w:val="22"/>
+          <w:szCs w:val="22"/>
+        </w:rPr>
+      </w:pPr>
+      <w:r>
+        <w:rPr>
+          <w:rFonts w:ascii="Times New Roman" w:hAnsi="Times New Roman" w:cs="Times New Roman"/>
+          <w:sz w:val="22"/>
+          <w:szCs w:val="22"/>
+        </w:rPr>
+        <w:t>Owned frontend features end-to-end, from requirement analysis and UI design to development, testing, deployment, and production support for enterprise-grade Angular SPAs (Angular 7–18+).</w:t>
       </w:r>
     </w:p>
     <w:p>
@@ -816,21 +812,23 @@
         <w:pStyle w:val="ListParagraph"/>
         <w:numPr>
           <w:ilvl w:val="0"/>
-          <w:numId w:val="16"/>
+          <w:numId w:val="19"/>
         </w:numPr>
         <w:spacing w:after="0"/>
         <w:ind w:right="-454"/>
         <w:rPr>
-          <w:sz w:val="22"/>
-          <w:szCs w:val="22"/>
-        </w:rPr>
-      </w:pPr>
-      <w:r>
-        <w:rPr>
-          <w:sz w:val="22"/>
-          <w:szCs w:val="22"/>
-        </w:rPr>
-        <w:t>Owned frontend features end-to-end, from requirement analysis and UI design to development, testing, deployment, and production support for enterprise-grade Angular SPAs (Angular 7–18+).</w:t>
+          <w:rFonts w:ascii="Times New Roman" w:hAnsi="Times New Roman" w:cs="Times New Roman"/>
+          <w:sz w:val="22"/>
+          <w:szCs w:val="22"/>
+        </w:rPr>
+      </w:pPr>
+      <w:r>
+        <w:rPr>
+          <w:rFonts w:ascii="Times New Roman" w:hAnsi="Times New Roman" w:cs="Times New Roman"/>
+          <w:sz w:val="22"/>
+          <w:szCs w:val="22"/>
+        </w:rPr>
+        <w:t>Designed and maintained scalable Angular applications supporting 2,000+ concurrent users.</w:t>
       </w:r>
     </w:p>
     <w:p>
@@ -838,21 +836,22 @@
         <w:pStyle w:val="ListParagraph"/>
         <w:numPr>
           <w:ilvl w:val="0"/>
-          <w:numId w:val="16"/>
+          <w:numId w:val="19"/>
         </w:numPr>
-        <w:spacing w:after="0"/>
         <w:ind w:right="-454"/>
         <w:rPr>
-          <w:sz w:val="22"/>
-          <w:szCs w:val="22"/>
-        </w:rPr>
-      </w:pPr>
-      <w:r>
-        <w:rPr>
-          <w:sz w:val="22"/>
-          <w:szCs w:val="22"/>
-        </w:rPr>
-        <w:t>Designed and maintained scalable Angular applications supporting 2,000+ users, improving page load performance by 30% through lazy loading and Webpack optimization.</w:t>
+          <w:rFonts w:ascii="Times New Roman" w:hAnsi="Times New Roman" w:cs="Times New Roman"/>
+          <w:sz w:val="22"/>
+          <w:szCs w:val="22"/>
+        </w:rPr>
+      </w:pPr>
+      <w:r>
+        <w:rPr>
+          <w:rFonts w:ascii="Times New Roman" w:hAnsi="Times New Roman" w:cs="Times New Roman"/>
+          <w:sz w:val="22"/>
+          <w:szCs w:val="22"/>
+        </w:rPr>
+        <w:t>Led technical design discussions and made key decisions on state management patterns, module structuring, and performance optimization strategies.</w:t>
       </w:r>
     </w:p>
     <w:p>
@@ -860,21 +859,22 @@
         <w:pStyle w:val="ListParagraph"/>
         <w:numPr>
           <w:ilvl w:val="0"/>
-          <w:numId w:val="16"/>
+          <w:numId w:val="19"/>
         </w:numPr>
-        <w:spacing w:after="0"/>
         <w:ind w:right="-454"/>
         <w:rPr>
-          <w:sz w:val="22"/>
-          <w:szCs w:val="22"/>
-        </w:rPr>
-      </w:pPr>
-      <w:r>
-        <w:rPr>
-          <w:sz w:val="22"/>
-          <w:szCs w:val="22"/>
-        </w:rPr>
-        <w:t>Led Angular modernization initiatives, migrating large-scale applications from Angular 7 to Angular 18+, improving scalability, security, and long-term maintainability.</w:t>
+          <w:rFonts w:ascii="Times New Roman" w:hAnsi="Times New Roman" w:cs="Times New Roman"/>
+          <w:sz w:val="22"/>
+          <w:szCs w:val="22"/>
+        </w:rPr>
+      </w:pPr>
+      <w:r>
+        <w:rPr>
+          <w:rFonts w:ascii="Times New Roman" w:hAnsi="Times New Roman" w:cs="Times New Roman"/>
+          <w:sz w:val="22"/>
+          <w:szCs w:val="22"/>
+        </w:rPr>
+        <w:t>Acted as frontend module owner, driving architectural alignment, scalability standards, and long-term maintainability.</w:t>
       </w:r>
     </w:p>
     <w:p>
@@ -882,76 +882,22 @@
         <w:pStyle w:val="ListParagraph"/>
         <w:numPr>
           <w:ilvl w:val="0"/>
-          <w:numId w:val="16"/>
+          <w:numId w:val="19"/>
         </w:numPr>
-        <w:spacing w:before="100" w:beforeAutospacing="1" w:after="100" w:afterAutospacing="1" w:line="240" w:lineRule="auto"/>
-        <w:rPr>
-          <w:rFonts w:eastAsia="Times New Roman" w:cstheme="minorHAnsi"/>
-          <w:kern w:val="0"/>
-          <w:sz w:val="22"/>
-          <w:szCs w:val="22"/>
-          <w:lang w:eastAsia="en-IN"/>
-          <w14:ligatures w14:val="none"/>
-        </w:rPr>
-      </w:pPr>
-      <w:r>
-        <w:rPr>
-          <w:rFonts w:eastAsia="Times New Roman" w:cstheme="minorHAnsi"/>
-          <w:kern w:val="0"/>
-          <w:sz w:val="22"/>
-          <w:szCs w:val="22"/>
-          <w:lang w:eastAsia="en-IN"/>
-          <w14:ligatures w14:val="none"/>
-        </w:rPr>
-        <w:t xml:space="preserve">Built reusable, modular UI components and implemented </w:t>
-      </w:r>
-      <w:r>
-        <w:rPr>
-          <w:rFonts w:eastAsia="Times New Roman" w:cstheme="minorHAnsi"/>
-          <w:b/>
-          <w:bCs/>
-          <w:kern w:val="0"/>
-          <w:sz w:val="22"/>
-          <w:szCs w:val="22"/>
-          <w:lang w:eastAsia="en-IN"/>
-          <w14:ligatures w14:val="none"/>
-        </w:rPr>
-        <w:t>NgRx-based state management</w:t>
-      </w:r>
-      <w:r>
-        <w:rPr>
-          <w:rFonts w:eastAsia="Times New Roman" w:cstheme="minorHAnsi"/>
-          <w:kern w:val="0"/>
-          <w:sz w:val="22"/>
-          <w:szCs w:val="22"/>
-          <w:lang w:eastAsia="en-IN"/>
-          <w14:ligatures w14:val="none"/>
-        </w:rPr>
-        <w:t xml:space="preserve">, integrating RESTful APIs using </w:t>
-      </w:r>
-      <w:r>
-        <w:rPr>
-          <w:rFonts w:eastAsia="Times New Roman" w:cstheme="minorHAnsi"/>
-          <w:b/>
-          <w:bCs/>
-          <w:kern w:val="0"/>
-          <w:sz w:val="22"/>
-          <w:szCs w:val="22"/>
-          <w:lang w:eastAsia="en-IN"/>
-          <w14:ligatures w14:val="none"/>
-        </w:rPr>
-        <w:t>RxJS</w:t>
-      </w:r>
-      <w:r>
-        <w:rPr>
-          <w:rFonts w:eastAsia="Times New Roman" w:cstheme="minorHAnsi"/>
-          <w:kern w:val="0"/>
-          <w:sz w:val="22"/>
-          <w:szCs w:val="22"/>
-          <w:lang w:eastAsia="en-IN"/>
-          <w14:ligatures w14:val="none"/>
-        </w:rPr>
-        <w:t xml:space="preserve"> for asynchronous data handling, error management, and real-time updates.</w:t>
+        <w:ind w:right="-454"/>
+        <w:rPr>
+          <w:rFonts w:ascii="Times New Roman" w:hAnsi="Times New Roman" w:cs="Times New Roman"/>
+          <w:sz w:val="22"/>
+          <w:szCs w:val="22"/>
+        </w:rPr>
+      </w:pPr>
+      <w:r>
+        <w:rPr>
+          <w:rFonts w:ascii="Times New Roman" w:hAnsi="Times New Roman" w:cs="Times New Roman"/>
+          <w:sz w:val="22"/>
+          <w:szCs w:val="22"/>
+        </w:rPr>
+        <w:t>Spearheaded enterprise-wide Angular version upgrade initiative across multiple applications.</w:t>
       </w:r>
     </w:p>
     <w:p>
@@ -959,52 +905,22 @@
         <w:pStyle w:val="ListParagraph"/>
         <w:numPr>
           <w:ilvl w:val="0"/>
-          <w:numId w:val="16"/>
+          <w:numId w:val="19"/>
         </w:numPr>
-        <w:spacing w:before="100" w:beforeAutospacing="1" w:after="100" w:afterAutospacing="1" w:line="240" w:lineRule="auto"/>
-        <w:rPr>
-          <w:rFonts w:eastAsia="Times New Roman" w:cstheme="minorHAnsi"/>
-          <w:kern w:val="0"/>
-          <w:sz w:val="22"/>
-          <w:szCs w:val="22"/>
-          <w:lang w:eastAsia="en-IN"/>
-          <w14:ligatures w14:val="none"/>
-        </w:rPr>
-      </w:pPr>
-      <w:r>
-        <w:rPr>
-          <w:rFonts w:eastAsia="Times New Roman" w:cstheme="minorHAnsi"/>
-          <w:kern w:val="0"/>
-          <w:sz w:val="22"/>
-          <w:szCs w:val="22"/>
-          <w:lang w:eastAsia="en-IN"/>
-          <w14:ligatures w14:val="none"/>
-        </w:rPr>
-        <w:t xml:space="preserve">Improved frontend stability and code quality by </w:t>
-      </w:r>
-      <w:r>
-        <w:rPr>
-          <w:rFonts w:eastAsia="Times New Roman" w:cstheme="minorHAnsi"/>
-          <w:b/>
-          <w:bCs/>
-          <w:kern w:val="0"/>
-          <w:sz w:val="22"/>
-          <w:szCs w:val="22"/>
-          <w:lang w:eastAsia="en-IN"/>
-          <w14:ligatures w14:val="none"/>
-        </w:rPr>
-        <w:t>25%</w:t>
-      </w:r>
-      <w:r>
-        <w:rPr>
-          <w:rFonts w:eastAsia="Times New Roman" w:cstheme="minorHAnsi"/>
-          <w:kern w:val="0"/>
-          <w:sz w:val="22"/>
-          <w:szCs w:val="22"/>
-          <w:lang w:eastAsia="en-IN"/>
-          <w14:ligatures w14:val="none"/>
-        </w:rPr>
-        <w:t xml:space="preserve"> through unit testing, peer code reviews, and structured debugging practices.</w:t>
+        <w:ind w:right="-454"/>
+        <w:rPr>
+          <w:rFonts w:ascii="Times New Roman" w:hAnsi="Times New Roman" w:cs="Times New Roman"/>
+          <w:sz w:val="22"/>
+          <w:szCs w:val="22"/>
+        </w:rPr>
+      </w:pPr>
+      <w:r>
+        <w:rPr>
+          <w:rFonts w:ascii="Times New Roman" w:hAnsi="Times New Roman" w:cs="Times New Roman"/>
+          <w:sz w:val="22"/>
+          <w:szCs w:val="22"/>
+        </w:rPr>
+        <w:t>Mentored 3–4 junior developers, conducted code reviews, and enforced coding standards to ensure maintainable and scalable frontend architecture.</w:t>
       </w:r>
     </w:p>
     <w:p>
@@ -1012,62 +928,272 @@
         <w:pStyle w:val="ListParagraph"/>
         <w:numPr>
           <w:ilvl w:val="0"/>
-          <w:numId w:val="16"/>
+          <w:numId w:val="19"/>
         </w:numPr>
+        <w:spacing w:before="100" w:beforeAutospacing="1" w:after="100" w:afterAutospacing="1" w:line="240" w:lineRule="auto"/>
+        <w:rPr>
+          <w:rFonts w:ascii="Times New Roman" w:eastAsia="Times New Roman" w:hAnsi="Times New Roman" w:cs="Times New Roman"/>
+          <w:kern w:val="0"/>
+          <w:sz w:val="22"/>
+          <w:szCs w:val="22"/>
+          <w:lang w:eastAsia="en-IN"/>
+          <w14:ligatures w14:val="none"/>
+        </w:rPr>
+      </w:pPr>
+      <w:r>
+        <w:rPr>
+          <w:rFonts w:ascii="Times New Roman" w:eastAsia="Times New Roman" w:hAnsi="Times New Roman" w:cs="Times New Roman"/>
+          <w:kern w:val="0"/>
+          <w:sz w:val="22"/>
+          <w:szCs w:val="22"/>
+          <w:lang w:eastAsia="en-IN"/>
+          <w14:ligatures w14:val="none"/>
+        </w:rPr>
+        <w:t xml:space="preserve">Built reusable, modular UI components and implemented </w:t>
+      </w:r>
+      <w:r>
+        <w:rPr>
+          <w:rFonts w:ascii="Times New Roman" w:eastAsia="Times New Roman" w:hAnsi="Times New Roman" w:cs="Times New Roman"/>
+          <w:b/>
+          <w:bCs/>
+          <w:kern w:val="0"/>
+          <w:sz w:val="22"/>
+          <w:szCs w:val="22"/>
+          <w:lang w:eastAsia="en-IN"/>
+          <w14:ligatures w14:val="none"/>
+        </w:rPr>
+        <w:t>NgRx-based state management</w:t>
+      </w:r>
+      <w:r>
+        <w:rPr>
+          <w:rFonts w:ascii="Times New Roman" w:eastAsia="Times New Roman" w:hAnsi="Times New Roman" w:cs="Times New Roman"/>
+          <w:kern w:val="0"/>
+          <w:sz w:val="22"/>
+          <w:szCs w:val="22"/>
+          <w:lang w:eastAsia="en-IN"/>
+          <w14:ligatures w14:val="none"/>
+        </w:rPr>
+        <w:t xml:space="preserve">, integrating RESTful APIs using </w:t>
+      </w:r>
+      <w:r>
+        <w:rPr>
+          <w:rFonts w:ascii="Times New Roman" w:eastAsia="Times New Roman" w:hAnsi="Times New Roman" w:cs="Times New Roman"/>
+          <w:b/>
+          <w:bCs/>
+          <w:kern w:val="0"/>
+          <w:sz w:val="22"/>
+          <w:szCs w:val="22"/>
+          <w:lang w:eastAsia="en-IN"/>
+          <w14:ligatures w14:val="none"/>
+        </w:rPr>
+        <w:t>RxJS</w:t>
+      </w:r>
+      <w:r>
+        <w:rPr>
+          <w:rFonts w:ascii="Times New Roman" w:eastAsia="Times New Roman" w:hAnsi="Times New Roman" w:cs="Times New Roman"/>
+          <w:kern w:val="0"/>
+          <w:sz w:val="22"/>
+          <w:szCs w:val="22"/>
+          <w:lang w:eastAsia="en-IN"/>
+          <w14:ligatures w14:val="none"/>
+        </w:rPr>
+        <w:t xml:space="preserve"> for asynchronous data handling, error management, and real-time updates.</w:t>
+      </w:r>
+    </w:p>
+    <w:p>
+      <w:pPr>
+        <w:pStyle w:val="ListParagraph"/>
+        <w:numPr>
+          <w:ilvl w:val="0"/>
+          <w:numId w:val="19"/>
+        </w:numPr>
+        <w:spacing w:before="100" w:beforeAutospacing="1" w:after="100" w:afterAutospacing="1"/>
+        <w:rPr>
+          <w:rFonts w:ascii="Times New Roman" w:eastAsia="Times New Roman" w:hAnsi="Times New Roman" w:cs="Times New Roman"/>
+          <w:kern w:val="0"/>
+          <w:sz w:val="22"/>
+          <w:szCs w:val="22"/>
+          <w:lang w:eastAsia="en-IN"/>
+          <w14:ligatures w14:val="none"/>
+        </w:rPr>
+      </w:pPr>
+      <w:r>
+        <w:rPr>
+          <w:rFonts w:ascii="Times New Roman" w:eastAsia="Times New Roman" w:hAnsi="Times New Roman" w:cs="Times New Roman"/>
+          <w:kern w:val="0"/>
+          <w:sz w:val="22"/>
+          <w:szCs w:val="22"/>
+          <w:lang w:eastAsia="en-IN"/>
+          <w14:ligatures w14:val="none"/>
+        </w:rPr>
+        <w:t xml:space="preserve">Improved frontend stability and code quality by </w:t>
+      </w:r>
+      <w:r>
+        <w:rPr>
+          <w:rFonts w:ascii="Times New Roman" w:eastAsia="Times New Roman" w:hAnsi="Times New Roman" w:cs="Times New Roman"/>
+          <w:b/>
+          <w:bCs/>
+          <w:kern w:val="0"/>
+          <w:sz w:val="22"/>
+          <w:szCs w:val="22"/>
+          <w:lang w:eastAsia="en-IN"/>
+          <w14:ligatures w14:val="none"/>
+        </w:rPr>
+        <w:t>25%</w:t>
+      </w:r>
+      <w:r>
+        <w:rPr>
+          <w:rFonts w:ascii="Times New Roman" w:eastAsia="Times New Roman" w:hAnsi="Times New Roman" w:cs="Times New Roman"/>
+          <w:kern w:val="0"/>
+          <w:sz w:val="22"/>
+          <w:szCs w:val="22"/>
+          <w:lang w:eastAsia="en-IN"/>
+          <w14:ligatures w14:val="none"/>
+        </w:rPr>
+        <w:t xml:space="preserve"> through unit testing, peer code reviews, and structured debugging practices.</w:t>
+      </w:r>
+    </w:p>
+    <w:p>
+      <w:pPr>
+        <w:pStyle w:val="ListParagraph"/>
+        <w:numPr>
+          <w:ilvl w:val="0"/>
+          <w:numId w:val="19"/>
+        </w:numPr>
+        <w:spacing w:before="100" w:beforeAutospacing="1" w:after="100" w:afterAutospacing="1"/>
+        <w:rPr>
+          <w:rFonts w:ascii="Times New Roman" w:eastAsia="Times New Roman" w:hAnsi="Times New Roman" w:cs="Times New Roman"/>
+          <w:kern w:val="0"/>
+          <w:sz w:val="22"/>
+          <w:szCs w:val="22"/>
+          <w:lang w:eastAsia="en-IN"/>
+          <w14:ligatures w14:val="none"/>
+        </w:rPr>
+      </w:pPr>
+      <w:r>
+        <w:rPr>
+          <w:rFonts w:ascii="Times New Roman" w:eastAsia="Times New Roman" w:hAnsi="Times New Roman" w:cs="Times New Roman"/>
+          <w:kern w:val="0"/>
+          <w:sz w:val="22"/>
+          <w:szCs w:val="22"/>
+          <w:lang w:eastAsia="en-IN"/>
+          <w14:ligatures w14:val="none"/>
+        </w:rPr>
+        <w:lastRenderedPageBreak/>
+        <w:t>Reduced page load time by 30% using lazy loading, Webpack optimization, and advanced change detection strategies, improving user engagement and reducing bounce rate.</w:t>
+      </w:r>
+    </w:p>
+    <w:p>
+      <w:pPr>
+        <w:pStyle w:val="ListParagraph"/>
+        <w:numPr>
+          <w:ilvl w:val="0"/>
+          <w:numId w:val="19"/>
+        </w:numPr>
+        <w:spacing w:before="100" w:beforeAutospacing="1" w:after="100" w:afterAutospacing="1"/>
+        <w:rPr>
+          <w:rFonts w:ascii="Times New Roman" w:eastAsia="Times New Roman" w:hAnsi="Times New Roman" w:cs="Times New Roman"/>
+          <w:kern w:val="0"/>
+          <w:sz w:val="22"/>
+          <w:szCs w:val="22"/>
+          <w:lang w:eastAsia="en-IN"/>
+          <w14:ligatures w14:val="none"/>
+        </w:rPr>
+      </w:pPr>
+      <w:r>
+        <w:rPr>
+          <w:rFonts w:ascii="Times New Roman" w:hAnsi="Times New Roman" w:cs="Times New Roman"/>
+          <w:sz w:val="22"/>
+          <w:szCs w:val="22"/>
+        </w:rPr>
+        <w:t>Collaborated closely with architects, backend engineers, designers, QA teams, and business stakeholders in Agile/Scrum environments, contributing to estimations, sprint planning, internationalization (i18n/L10n), RTL support, and production releases.</w:t>
+      </w:r>
+    </w:p>
+    <w:p>
+      <w:pPr>
+        <w:pStyle w:val="ListParagraph"/>
         <w:spacing w:after="0"/>
         <w:ind w:right="-454"/>
         <w:rPr>
-          <w:sz w:val="22"/>
-          <w:szCs w:val="22"/>
-        </w:rPr>
-      </w:pPr>
-      <w:r>
-        <w:rPr>
-          <w:sz w:val="22"/>
-          <w:szCs w:val="22"/>
-        </w:rPr>
-        <w:t>Collaborated closely with architects, backend engineers, designers, QA teams, and business stakeholders in Agile/Scrum environments, contributing to estimations, sprint planning, internationalization (i18n/L10n), RTL support, and production releases.</w:t>
-      </w:r>
+          <w:rFonts w:ascii="Times New Roman" w:hAnsi="Times New Roman" w:cs="Times New Roman"/>
+          <w:sz w:val="22"/>
+          <w:szCs w:val="22"/>
+        </w:rPr>
+      </w:pPr>
     </w:p>
     <w:p>
       <w:pPr>
         <w:ind w:left="-454" w:right="-454"/>
         <w:rPr>
-          <w:sz w:val="22"/>
-          <w:szCs w:val="22"/>
-        </w:rPr>
-      </w:pPr>
-      <w:r>
-        <w:rPr>
-          <w:sz w:val="22"/>
-          <w:szCs w:val="22"/>
-        </w:rPr>
-        <w:pict w14:anchorId="214D7EB1">
-          <v:rect id="_x0000_i1028" style="width:0;height:1.5pt" o:hralign="center" o:hrstd="t" o:hr="t" fillcolor="#a0a0a0" stroked="f"/>
-        </w:pict>
+          <w:rFonts w:ascii="Times New Roman" w:hAnsi="Times New Roman" w:cs="Times New Roman"/>
+          <w:b/>
+          <w:bCs/>
+          <w:color w:val="000000" w:themeColor="text1"/>
+          <w:sz w:val="26"/>
+          <w:szCs w:val="26"/>
+        </w:rPr>
+      </w:pPr>
+      <w:r>
+        <w:rPr>
+          <w:rFonts w:ascii="Times New Roman" w:hAnsi="Times New Roman" w:cs="Times New Roman"/>
+          <w:b/>
+          <w:bCs/>
+          <w:color w:val="000000" w:themeColor="text1"/>
+          <w:sz w:val="26"/>
+          <w:szCs w:val="26"/>
+        </w:rPr>
+        <w:t>KEY PROJECTS</w:t>
       </w:r>
     </w:p>
     <w:p>
       <w:pPr>
+        <w:spacing w:after="0"/>
         <w:ind w:left="-454" w:right="-454"/>
         <w:rPr>
-          <w:b/>
-          <w:bCs/>
-          <w:color w:val="4472C4" w:themeColor="accent1"/>
-          <w:sz w:val="22"/>
-          <w:szCs w:val="22"/>
-        </w:rPr>
-      </w:pPr>
-      <w:r>
-        <w:rPr>
-          <w:b/>
-          <w:bCs/>
-          <w:color w:val="4472C4" w:themeColor="accent1"/>
-          <w:sz w:val="22"/>
-          <w:szCs w:val="22"/>
-        </w:rPr>
-        <w:lastRenderedPageBreak/>
-        <w:t>KEY PROJECTS</w:t>
+          <w:rFonts w:ascii="Times New Roman" w:hAnsi="Times New Roman" w:cs="Times New Roman"/>
+          <w:sz w:val="22"/>
+          <w:szCs w:val="22"/>
+        </w:rPr>
+      </w:pPr>
+      <w:r>
+        <w:rPr>
+          <w:rFonts w:ascii="Times New Roman" w:hAnsi="Times New Roman" w:cs="Times New Roman"/>
+          <w:b/>
+          <w:bCs/>
+          <w:sz w:val="22"/>
+          <w:szCs w:val="22"/>
+        </w:rPr>
+        <w:t xml:space="preserve">Project: Automated Traveller Helpdesk for Incoming Tourists &amp; Homebound Indians </w:t>
+      </w:r>
+      <w:r>
+        <w:rPr>
+          <w:rFonts w:ascii="Times New Roman" w:hAnsi="Times New Roman" w:cs="Times New Roman"/>
+          <w:b/>
+          <w:bCs/>
+          <w:sz w:val="22"/>
+          <w:szCs w:val="22"/>
+        </w:rPr>
+        <w:t xml:space="preserve">– </w:t>
+      </w:r>
+      <w:r>
+        <w:rPr>
+          <w:rFonts w:ascii="Times New Roman" w:hAnsi="Times New Roman" w:cs="Times New Roman"/>
+          <w:b/>
+          <w:bCs/>
+          <w:sz w:val="22"/>
+          <w:szCs w:val="22"/>
+        </w:rPr>
+        <w:t>(</w:t>
+      </w:r>
+      <w:r>
+        <w:rPr>
+          <w:rFonts w:ascii="Times New Roman" w:hAnsi="Times New Roman" w:cs="Times New Roman"/>
+          <w:b/>
+          <w:bCs/>
+          <w:sz w:val="22"/>
+          <w:szCs w:val="22"/>
+        </w:rPr>
+        <w:t>CBIC Government of India)</w:t>
       </w:r>
     </w:p>
     <w:p>
@@ -1075,18 +1201,54 @@
         <w:spacing w:after="0"/>
         <w:ind w:left="-454" w:right="-454"/>
         <w:rPr>
-          <w:sz w:val="22"/>
-          <w:szCs w:val="22"/>
-        </w:rPr>
-      </w:pPr>
-      <w:r>
-        <w:rPr>
-          <w:b/>
-          <w:bCs/>
-          <w:sz w:val="22"/>
-          <w:szCs w:val="22"/>
-        </w:rPr>
-        <w:t>ATITHI – CBIC (Government of India)</w:t>
+          <w:rFonts w:ascii="Times New Roman" w:hAnsi="Times New Roman" w:cs="Times New Roman"/>
+          <w:sz w:val="22"/>
+          <w:szCs w:val="22"/>
+        </w:rPr>
+      </w:pPr>
+      <w:r>
+        <w:rPr>
+          <w:rFonts w:ascii="Times New Roman" w:hAnsi="Times New Roman" w:cs="Times New Roman"/>
+          <w:b/>
+          <w:bCs/>
+          <w:sz w:val="22"/>
+          <w:szCs w:val="22"/>
+        </w:rPr>
+        <w:t>Role:</w:t>
+      </w:r>
+      <w:r>
+        <w:rPr>
+          <w:rFonts w:ascii="Times New Roman" w:hAnsi="Times New Roman" w:cs="Times New Roman"/>
+          <w:sz w:val="22"/>
+          <w:szCs w:val="22"/>
+        </w:rPr>
+        <w:t xml:space="preserve"> Senior Angular Frontend Developer</w:t>
+      </w:r>
+      <w:r>
+        <w:rPr>
+          <w:rFonts w:ascii="Times New Roman" w:hAnsi="Times New Roman" w:cs="Times New Roman"/>
+          <w:sz w:val="22"/>
+          <w:szCs w:val="22"/>
+        </w:rPr>
+        <w:br/>
+      </w:r>
+      <w:r>
+        <w:rPr>
+          <w:rFonts w:ascii="Times New Roman" w:hAnsi="Times New Roman" w:cs="Times New Roman"/>
+          <w:b/>
+          <w:bCs/>
+          <w:sz w:val="22"/>
+          <w:szCs w:val="22"/>
+        </w:rPr>
+        <w:t>Duration:</w:t>
+      </w:r>
+      <w:r>
+        <w:rPr>
+          <w:rFonts w:ascii="Times New Roman" w:hAnsi="Times New Roman" w:cs="Times New Roman"/>
+          <w:sz w:val="22"/>
+          <w:szCs w:val="22"/>
+        </w:rPr>
+        <w:t xml:space="preserve"> March 2024 – Present</w:t>
       </w:r>
     </w:p>
     <w:p>
@@ -1094,48 +1256,29 @@
         <w:spacing w:after="0"/>
         <w:ind w:left="-454" w:right="-454"/>
         <w:rPr>
-          <w:sz w:val="22"/>
-          <w:szCs w:val="22"/>
-        </w:rPr>
-      </w:pPr>
-      <w:r>
-        <w:rPr>
-          <w:b/>
-          <w:bCs/>
-          <w:sz w:val="22"/>
-          <w:szCs w:val="22"/>
-        </w:rPr>
-        <w:t>Role:</w:t>
-      </w:r>
-      <w:r>
-        <w:rPr>
-          <w:sz w:val="22"/>
-          <w:szCs w:val="22"/>
-        </w:rPr>
-        <w:t xml:space="preserve"> Senior Angular Frontend Developer</w:t>
-      </w:r>
-      <w:r>
-        <w:rPr>
+          <w:rFonts w:ascii="Times New Roman" w:hAnsi="Times New Roman" w:cs="Times New Roman"/>
+          <w:sz w:val="22"/>
+          <w:szCs w:val="22"/>
+        </w:rPr>
+      </w:pPr>
+      <w:r>
+        <w:rPr>
+          <w:rFonts w:ascii="Times New Roman" w:hAnsi="Times New Roman" w:cs="Times New Roman"/>
+          <w:b/>
+          <w:bCs/>
+          <w:sz w:val="22"/>
+          <w:szCs w:val="22"/>
+        </w:rPr>
+        <w:t>Technology Stack:</w:t>
+      </w:r>
+      <w:r>
+        <w:rPr>
+          <w:rFonts w:ascii="Times New Roman" w:hAnsi="Times New Roman" w:cs="Times New Roman"/>
           <w:sz w:val="22"/>
           <w:szCs w:val="22"/>
         </w:rPr>
         <w:br/>
-      </w:r>
-      <w:r>
-        <w:rPr>
-          <w:b/>
-          <w:bCs/>
-          <w:sz w:val="22"/>
-          <w:szCs w:val="22"/>
-        </w:rPr>
-        <w:t>Duration:</w:t>
-      </w:r>
-      <w:r>
-        <w:rPr>
-          <w:sz w:val="22"/>
-          <w:szCs w:val="22"/>
-        </w:rPr>
-        <w:t xml:space="preserve"> March 2024 – Present</w:t>
+        <w:t>Angular 16+, TypeScript, Angular Forms, Reactive Forms, RxJS, HTML5, CSS3, SCSS, JSON, REST APIs, Git, Agile/Scrum</w:t>
       </w:r>
     </w:p>
     <w:p>
@@ -1143,26 +1286,29 @@
         <w:spacing w:after="0"/>
         <w:ind w:left="-454" w:right="-454"/>
         <w:rPr>
-          <w:sz w:val="22"/>
-          <w:szCs w:val="22"/>
-        </w:rPr>
-      </w:pPr>
-      <w:r>
-        <w:rPr>
-          <w:b/>
-          <w:bCs/>
-          <w:sz w:val="22"/>
-          <w:szCs w:val="22"/>
-        </w:rPr>
-        <w:t>Technology Stack:</w:t>
-      </w:r>
-      <w:r>
-        <w:rPr>
+          <w:rFonts w:ascii="Times New Roman" w:hAnsi="Times New Roman" w:cs="Times New Roman"/>
+          <w:sz w:val="22"/>
+          <w:szCs w:val="22"/>
+        </w:rPr>
+      </w:pPr>
+      <w:r>
+        <w:rPr>
+          <w:rFonts w:ascii="Times New Roman" w:hAnsi="Times New Roman" w:cs="Times New Roman"/>
+          <w:b/>
+          <w:bCs/>
+          <w:sz w:val="22"/>
+          <w:szCs w:val="22"/>
+        </w:rPr>
+        <w:t>Project Overview:</w:t>
+      </w:r>
+      <w:r>
+        <w:rPr>
+          <w:rFonts w:ascii="Times New Roman" w:hAnsi="Times New Roman" w:cs="Times New Roman"/>
           <w:sz w:val="22"/>
           <w:szCs w:val="22"/>
         </w:rPr>
         <w:br/>
-        <w:t>Angular 16+, TypeScript, Angular Forms, Reactive Forms, RxJS, HTML5, CSS3, SCSS, JSON, REST APIs, Git, Agile/Scrum</w:t>
+        <w:t>National-level digital customs declaration platform used across India, designed to handle high concurrent traffic under strict security and compliance standards.</w:t>
       </w:r>
     </w:p>
     <w:p>
@@ -1170,39 +1316,14 @@
         <w:spacing w:after="0"/>
         <w:ind w:left="-454" w:right="-454"/>
         <w:rPr>
-          <w:sz w:val="22"/>
-          <w:szCs w:val="22"/>
-        </w:rPr>
-      </w:pPr>
-      <w:r>
-        <w:rPr>
-          <w:b/>
-          <w:bCs/>
-          <w:sz w:val="22"/>
-          <w:szCs w:val="22"/>
-        </w:rPr>
-        <w:t>Project Overview:</w:t>
-      </w:r>
-      <w:r>
-        <w:rPr>
-          <w:sz w:val="22"/>
-          <w:szCs w:val="22"/>
-        </w:rPr>
-        <w:br/>
-        <w:t>National-level digital customs declaration platform used across India, designed to handle high concurrent traffic under strict security and compliance standards.</w:t>
-      </w:r>
-    </w:p>
-    <w:p>
-      <w:pPr>
-        <w:spacing w:after="0"/>
-        <w:ind w:left="-454" w:right="-454"/>
-        <w:rPr>
-          <w:sz w:val="22"/>
-          <w:szCs w:val="22"/>
-        </w:rPr>
-      </w:pPr>
-      <w:r>
-        <w:rPr>
+          <w:rFonts w:ascii="Times New Roman" w:hAnsi="Times New Roman" w:cs="Times New Roman"/>
+          <w:sz w:val="22"/>
+          <w:szCs w:val="22"/>
+        </w:rPr>
+      </w:pPr>
+      <w:r>
+        <w:rPr>
+          <w:rFonts w:ascii="Times New Roman" w:hAnsi="Times New Roman" w:cs="Times New Roman"/>
           <w:b/>
           <w:bCs/>
           <w:sz w:val="22"/>
@@ -1220,7 +1341,7 @@
         </w:numPr>
         <w:spacing w:after="0" w:line="240" w:lineRule="auto"/>
         <w:rPr>
-          <w:rFonts w:eastAsia="Times New Roman" w:cstheme="minorHAnsi"/>
+          <w:rFonts w:ascii="Times New Roman" w:eastAsia="Times New Roman" w:hAnsi="Times New Roman" w:cs="Times New Roman"/>
           <w:kern w:val="0"/>
           <w:sz w:val="22"/>
           <w:szCs w:val="22"/>
@@ -1230,7 +1351,7 @@
       </w:pPr>
       <w:r>
         <w:rPr>
-          <w:rFonts w:eastAsia="Times New Roman" w:cstheme="minorHAnsi"/>
+          <w:rFonts w:ascii="Times New Roman" w:eastAsia="Times New Roman" w:hAnsi="Times New Roman" w:cs="Times New Roman"/>
           <w:kern w:val="0"/>
           <w:sz w:val="22"/>
           <w:szCs w:val="22"/>
@@ -1241,7 +1362,7 @@
       </w:r>
       <w:r>
         <w:rPr>
-          <w:rFonts w:eastAsia="Times New Roman" w:cstheme="minorHAnsi"/>
+          <w:rFonts w:ascii="Times New Roman" w:eastAsia="Times New Roman" w:hAnsi="Times New Roman" w:cs="Times New Roman"/>
           <w:b/>
           <w:bCs/>
           <w:kern w:val="0"/>
@@ -1254,7 +1375,7 @@
       </w:r>
       <w:r>
         <w:rPr>
-          <w:rFonts w:eastAsia="Times New Roman" w:cstheme="minorHAnsi"/>
+          <w:rFonts w:ascii="Times New Roman" w:eastAsia="Times New Roman" w:hAnsi="Times New Roman" w:cs="Times New Roman"/>
           <w:kern w:val="0"/>
           <w:sz w:val="22"/>
           <w:szCs w:val="22"/>
@@ -1273,7 +1394,7 @@
         </w:numPr>
         <w:spacing w:before="100" w:beforeAutospacing="1" w:after="0" w:line="240" w:lineRule="auto"/>
         <w:rPr>
-          <w:rFonts w:eastAsia="Times New Roman" w:cstheme="minorHAnsi"/>
+          <w:rFonts w:ascii="Times New Roman" w:eastAsia="Times New Roman" w:hAnsi="Times New Roman" w:cs="Times New Roman"/>
           <w:kern w:val="0"/>
           <w:sz w:val="22"/>
           <w:szCs w:val="22"/>
@@ -1283,7 +1404,7 @@
       </w:pPr>
       <w:r>
         <w:rPr>
-          <w:rFonts w:eastAsia="Times New Roman" w:cstheme="minorHAnsi"/>
+          <w:rFonts w:ascii="Times New Roman" w:eastAsia="Times New Roman" w:hAnsi="Times New Roman" w:cs="Times New Roman"/>
           <w:kern w:val="0"/>
           <w:sz w:val="22"/>
           <w:szCs w:val="22"/>
@@ -1294,7 +1415,7 @@
       </w:r>
       <w:r>
         <w:rPr>
-          <w:rFonts w:eastAsia="Times New Roman" w:cstheme="minorHAnsi"/>
+          <w:rFonts w:ascii="Times New Roman" w:eastAsia="Times New Roman" w:hAnsi="Times New Roman" w:cs="Times New Roman"/>
           <w:b/>
           <w:bCs/>
           <w:kern w:val="0"/>
@@ -1307,7 +1428,7 @@
       </w:r>
       <w:r>
         <w:rPr>
-          <w:rFonts w:eastAsia="Times New Roman" w:cstheme="minorHAnsi"/>
+          <w:rFonts w:ascii="Times New Roman" w:eastAsia="Times New Roman" w:hAnsi="Times New Roman" w:cs="Times New Roman"/>
           <w:kern w:val="0"/>
           <w:sz w:val="22"/>
           <w:szCs w:val="22"/>
@@ -1326,7 +1447,7 @@
         </w:numPr>
         <w:spacing w:before="100" w:beforeAutospacing="1" w:after="0" w:line="240" w:lineRule="auto"/>
         <w:rPr>
-          <w:rFonts w:eastAsia="Times New Roman" w:cstheme="minorHAnsi"/>
+          <w:rFonts w:ascii="Times New Roman" w:eastAsia="Times New Roman" w:hAnsi="Times New Roman" w:cs="Times New Roman"/>
           <w:kern w:val="0"/>
           <w:sz w:val="22"/>
           <w:szCs w:val="22"/>
@@ -1336,7 +1457,7 @@
       </w:pPr>
       <w:r>
         <w:rPr>
-          <w:rFonts w:eastAsia="Times New Roman" w:cstheme="minorHAnsi"/>
+          <w:rFonts w:ascii="Times New Roman" w:eastAsia="Times New Roman" w:hAnsi="Times New Roman" w:cs="Times New Roman"/>
           <w:kern w:val="0"/>
           <w:sz w:val="22"/>
           <w:szCs w:val="22"/>
@@ -1347,7 +1468,7 @@
       </w:r>
       <w:r>
         <w:rPr>
-          <w:rFonts w:eastAsia="Times New Roman" w:cstheme="minorHAnsi"/>
+          <w:rFonts w:ascii="Times New Roman" w:eastAsia="Times New Roman" w:hAnsi="Times New Roman" w:cs="Times New Roman"/>
           <w:b/>
           <w:bCs/>
           <w:kern w:val="0"/>
@@ -1360,7 +1481,7 @@
       </w:r>
       <w:r>
         <w:rPr>
-          <w:rFonts w:eastAsia="Times New Roman" w:cstheme="minorHAnsi"/>
+          <w:rFonts w:ascii="Times New Roman" w:eastAsia="Times New Roman" w:hAnsi="Times New Roman" w:cs="Times New Roman"/>
           <w:kern w:val="0"/>
           <w:sz w:val="22"/>
           <w:szCs w:val="22"/>
@@ -1377,9 +1498,9 @@
           <w:ilvl w:val="0"/>
           <w:numId w:val="13"/>
         </w:numPr>
-        <w:spacing w:before="100" w:beforeAutospacing="1" w:after="0" w:line="240" w:lineRule="auto"/>
-        <w:rPr>
-          <w:rFonts w:eastAsia="Times New Roman" w:cstheme="minorHAnsi"/>
+        <w:spacing w:before="100" w:beforeAutospacing="1"/>
+        <w:rPr>
+          <w:rFonts w:ascii="Times New Roman" w:eastAsia="Times New Roman" w:hAnsi="Times New Roman" w:cs="Times New Roman"/>
           <w:kern w:val="0"/>
           <w:sz w:val="22"/>
           <w:szCs w:val="22"/>
@@ -1389,7 +1510,7 @@
       </w:pPr>
       <w:r>
         <w:rPr>
-          <w:rFonts w:eastAsia="Times New Roman" w:cstheme="minorHAnsi"/>
+          <w:rFonts w:ascii="Times New Roman" w:eastAsia="Times New Roman" w:hAnsi="Times New Roman" w:cs="Times New Roman"/>
           <w:kern w:val="0"/>
           <w:sz w:val="22"/>
           <w:szCs w:val="22"/>
@@ -1400,7 +1521,7 @@
       </w:r>
       <w:r>
         <w:rPr>
-          <w:rFonts w:eastAsia="Times New Roman" w:cstheme="minorHAnsi"/>
+          <w:rFonts w:ascii="Times New Roman" w:eastAsia="Times New Roman" w:hAnsi="Times New Roman" w:cs="Times New Roman"/>
           <w:b/>
           <w:bCs/>
           <w:kern w:val="0"/>
@@ -1413,7 +1534,7 @@
       </w:r>
       <w:r>
         <w:rPr>
-          <w:rFonts w:eastAsia="Times New Roman" w:cstheme="minorHAnsi"/>
+          <w:rFonts w:ascii="Times New Roman" w:eastAsia="Times New Roman" w:hAnsi="Times New Roman" w:cs="Times New Roman"/>
           <w:kern w:val="0"/>
           <w:sz w:val="22"/>
           <w:szCs w:val="22"/>
@@ -1430,9 +1551,9 @@
           <w:ilvl w:val="0"/>
           <w:numId w:val="13"/>
         </w:numPr>
-        <w:spacing w:before="100" w:beforeAutospacing="1" w:after="0" w:line="240" w:lineRule="auto"/>
-        <w:rPr>
-          <w:rFonts w:eastAsia="Times New Roman" w:cstheme="minorHAnsi"/>
+        <w:spacing w:before="100" w:beforeAutospacing="1"/>
+        <w:rPr>
+          <w:rFonts w:ascii="Times New Roman" w:eastAsia="Times New Roman" w:hAnsi="Times New Roman" w:cs="Times New Roman"/>
           <w:kern w:val="0"/>
           <w:sz w:val="22"/>
           <w:szCs w:val="22"/>
@@ -1442,117 +1563,98 @@
       </w:pPr>
       <w:r>
         <w:rPr>
-          <w:rFonts w:eastAsia="Times New Roman" w:cstheme="minorHAnsi"/>
+          <w:rFonts w:ascii="Times New Roman" w:eastAsia="Times New Roman" w:hAnsi="Times New Roman" w:cs="Times New Roman"/>
           <w:kern w:val="0"/>
           <w:sz w:val="22"/>
           <w:szCs w:val="22"/>
           <w:lang w:eastAsia="en-IN"/>
           <w14:ligatures w14:val="none"/>
         </w:rPr>
-        <w:t xml:space="preserve">Collaborated with cross-functional teams in an </w:t>
-      </w:r>
-      <w:r>
-        <w:rPr>
-          <w:rFonts w:eastAsia="Times New Roman" w:cstheme="minorHAnsi"/>
-          <w:b/>
-          <w:bCs/>
+        <w:t>Implemented frontend security best practices including XSS mitigation using Angular DomSanitizer, secure form validation, input sanitization, and token-based REST API integration aligned with OWASP guidelines.</w:t>
+      </w:r>
+    </w:p>
+    <w:p>
+      <w:pPr>
+        <w:pStyle w:val="ListParagraph"/>
+        <w:spacing w:before="100" w:beforeAutospacing="1" w:after="0" w:line="240" w:lineRule="auto"/>
+        <w:ind w:left="266"/>
+        <w:rPr>
+          <w:rFonts w:ascii="Times New Roman" w:eastAsia="Times New Roman" w:hAnsi="Times New Roman" w:cs="Times New Roman"/>
           <w:kern w:val="0"/>
-          <w:sz w:val="22"/>
-          <w:szCs w:val="22"/>
           <w:lang w:eastAsia="en-IN"/>
           <w14:ligatures w14:val="none"/>
         </w:rPr>
-        <w:t>Agile/Scrum</w:t>
-      </w:r>
-      <w:r>
-        <w:rPr>
-          <w:rFonts w:eastAsia="Times New Roman" w:cstheme="minorHAnsi"/>
-          <w:kern w:val="0"/>
-          <w:sz w:val="22"/>
-          <w:szCs w:val="22"/>
-          <w:lang w:eastAsia="en-IN"/>
-          <w14:ligatures w14:val="none"/>
-        </w:rPr>
-        <w:t xml:space="preserve"> environment.</w:t>
-      </w:r>
+      </w:pPr>
     </w:p>
     <w:p>
       <w:pPr>
-        <w:ind w:right="-454"/>
-        <w:rPr>
-          <w:b/>
-          <w:bCs/>
-          <w:sz w:val="22"/>
-          <w:szCs w:val="22"/>
-        </w:rPr>
-      </w:pPr>
+        <w:spacing w:after="0"/>
+        <w:ind w:left="-454" w:right="-454"/>
+        <w:rPr>
+          <w:rFonts w:ascii="Times New Roman" w:hAnsi="Times New Roman" w:cs="Times New Roman"/>
+          <w:b/>
+          <w:bCs/>
+        </w:rPr>
+      </w:pPr>
+      <w:r>
+        <w:rPr>
+          <w:rFonts w:ascii="Times New Roman" w:hAnsi="Times New Roman" w:cs="Times New Roman"/>
+        </w:rPr>
+        <w:pict w14:anchorId="222C1CB2">
+          <v:rect id="_x0000_i1025" style="width:0;height:1.5pt" o:hralign="center" o:hrstd="t" o:hr="t" fillcolor="#a0a0a0" stroked="f"/>
+        </w:pict>
+      </w:r>
     </w:p>
     <w:p>
       <w:pPr>
         <w:spacing w:after="0"/>
         <w:ind w:left="-454" w:right="-454"/>
         <w:rPr>
-          <w:sz w:val="22"/>
-          <w:szCs w:val="22"/>
-        </w:rPr>
-      </w:pPr>
-      <w:r>
-        <w:rPr>
-          <w:b/>
-          <w:bCs/>
-          <w:sz w:val="22"/>
-          <w:szCs w:val="22"/>
-        </w:rPr>
-        <w:t>Digital Passport System (DPS) – Hitachi Energy</w:t>
-      </w:r>
+          <w:rFonts w:ascii="Times New Roman" w:hAnsi="Times New Roman" w:cs="Times New Roman"/>
+          <w:b/>
+          <w:bCs/>
+        </w:rPr>
+      </w:pPr>
     </w:p>
     <w:p>
       <w:pPr>
         <w:spacing w:after="0"/>
         <w:ind w:left="-454" w:right="-454"/>
         <w:rPr>
-          <w:sz w:val="22"/>
-          <w:szCs w:val="22"/>
-        </w:rPr>
-      </w:pPr>
-      <w:r>
-        <w:rPr>
-          <w:b/>
-          <w:bCs/>
-          <w:sz w:val="22"/>
-          <w:szCs w:val="22"/>
-        </w:rPr>
-        <w:t>Role:</w:t>
-      </w:r>
-      <w:r>
-        <w:rPr>
-          <w:sz w:val="22"/>
-          <w:szCs w:val="22"/>
-        </w:rPr>
-        <w:t xml:space="preserve"> Frontend Developer (Angular Specialist)</w:t>
-      </w:r>
-      <w:r>
-        <w:rPr>
-          <w:sz w:val="22"/>
-          <w:szCs w:val="22"/>
-        </w:rPr>
-        <w:br/>
-      </w:r>
-      <w:r>
-        <w:rPr>
-          <w:b/>
-          <w:bCs/>
-          <w:sz w:val="22"/>
-          <w:szCs w:val="22"/>
-        </w:rPr>
-        <w:t>Duration:</w:t>
-      </w:r>
-      <w:r>
-        <w:rPr>
-          <w:sz w:val="22"/>
-          <w:szCs w:val="22"/>
-        </w:rPr>
-        <w:t xml:space="preserve"> April 2021 – March 2024</w:t>
+          <w:rFonts w:ascii="Times New Roman" w:hAnsi="Times New Roman" w:cs="Times New Roman"/>
+          <w:sz w:val="22"/>
+          <w:szCs w:val="22"/>
+        </w:rPr>
+      </w:pPr>
+      <w:r>
+        <w:rPr>
+          <w:rFonts w:ascii="Times New Roman" w:hAnsi="Times New Roman" w:cs="Times New Roman"/>
+          <w:b/>
+          <w:bCs/>
+          <w:sz w:val="22"/>
+          <w:szCs w:val="22"/>
+        </w:rPr>
+        <w:t xml:space="preserve">Project: </w:t>
+      </w:r>
+      <w:r>
+        <w:rPr>
+          <w:rFonts w:ascii="Times New Roman" w:hAnsi="Times New Roman" w:cs="Times New Roman"/>
+          <w:b/>
+          <w:bCs/>
+          <w:sz w:val="22"/>
+          <w:szCs w:val="22"/>
+        </w:rPr>
+        <w:t>Digital Passport System (Hitachi Energy</w:t>
+      </w:r>
+      <w:r>
+        <w:rPr>
+          <w:rFonts w:ascii="Times New Roman" w:hAnsi="Times New Roman" w:cs="Times New Roman"/>
+          <w:b/>
+          <w:bCs/>
+          <w:sz w:val="22"/>
+          <w:szCs w:val="22"/>
+        </w:rPr>
+        <w:t>)</w:t>
       </w:r>
     </w:p>
     <w:p>
@@ -1560,12 +1662,69 @@
         <w:spacing w:after="0"/>
         <w:ind w:left="-454" w:right="-454"/>
         <w:rPr>
-          <w:sz w:val="22"/>
-          <w:szCs w:val="22"/>
-        </w:rPr>
-      </w:pPr>
-      <w:r>
-        <w:rPr>
+          <w:rFonts w:ascii="Times New Roman" w:hAnsi="Times New Roman" w:cs="Times New Roman"/>
+          <w:sz w:val="22"/>
+          <w:szCs w:val="22"/>
+        </w:rPr>
+      </w:pPr>
+      <w:r>
+        <w:rPr>
+          <w:rFonts w:ascii="Times New Roman" w:hAnsi="Times New Roman" w:cs="Times New Roman"/>
+          <w:b/>
+          <w:bCs/>
+          <w:sz w:val="22"/>
+          <w:szCs w:val="22"/>
+        </w:rPr>
+        <w:t>Role:</w:t>
+      </w:r>
+      <w:r>
+        <w:rPr>
+          <w:rFonts w:ascii="Times New Roman" w:hAnsi="Times New Roman" w:cs="Times New Roman"/>
+          <w:sz w:val="22"/>
+          <w:szCs w:val="22"/>
+        </w:rPr>
+        <w:t xml:space="preserve"> Frontend Developer (Angular Specialist)</w:t>
+      </w:r>
+      <w:r>
+        <w:rPr>
+          <w:rFonts w:ascii="Times New Roman" w:hAnsi="Times New Roman" w:cs="Times New Roman"/>
+          <w:sz w:val="22"/>
+          <w:szCs w:val="22"/>
+        </w:rPr>
+        <w:br/>
+      </w:r>
+      <w:r>
+        <w:rPr>
+          <w:rFonts w:ascii="Times New Roman" w:hAnsi="Times New Roman" w:cs="Times New Roman"/>
+          <w:b/>
+          <w:bCs/>
+          <w:sz w:val="22"/>
+          <w:szCs w:val="22"/>
+        </w:rPr>
+        <w:t>Duration:</w:t>
+      </w:r>
+      <w:r>
+        <w:rPr>
+          <w:rFonts w:ascii="Times New Roman" w:hAnsi="Times New Roman" w:cs="Times New Roman"/>
+          <w:sz w:val="22"/>
+          <w:szCs w:val="22"/>
+        </w:rPr>
+        <w:t xml:space="preserve"> April 2021 – March 2024</w:t>
+      </w:r>
+    </w:p>
+    <w:p>
+      <w:pPr>
+        <w:spacing w:after="0"/>
+        <w:ind w:left="-454" w:right="-454"/>
+        <w:rPr>
+          <w:rFonts w:ascii="Times New Roman" w:hAnsi="Times New Roman" w:cs="Times New Roman"/>
+          <w:sz w:val="22"/>
+          <w:szCs w:val="22"/>
+        </w:rPr>
+      </w:pPr>
+      <w:r>
+        <w:rPr>
+          <w:rFonts w:ascii="Times New Roman" w:hAnsi="Times New Roman" w:cs="Times New Roman"/>
           <w:b/>
           <w:bCs/>
           <w:sz w:val="22"/>
@@ -1575,6 +1734,7 @@
       </w:r>
       <w:r>
         <w:rPr>
+          <w:rFonts w:ascii="Times New Roman" w:hAnsi="Times New Roman" w:cs="Times New Roman"/>
           <w:sz w:val="22"/>
           <w:szCs w:val="22"/>
         </w:rPr>
@@ -1587,12 +1747,14 @@
         <w:spacing w:after="0"/>
         <w:ind w:left="-454" w:right="-454"/>
         <w:rPr>
-          <w:sz w:val="22"/>
-          <w:szCs w:val="22"/>
-        </w:rPr>
-      </w:pPr>
-      <w:r>
-        <w:rPr>
+          <w:rFonts w:ascii="Times New Roman" w:hAnsi="Times New Roman" w:cs="Times New Roman"/>
+          <w:sz w:val="22"/>
+          <w:szCs w:val="22"/>
+        </w:rPr>
+      </w:pPr>
+      <w:r>
+        <w:rPr>
+          <w:rFonts w:ascii="Times New Roman" w:hAnsi="Times New Roman" w:cs="Times New Roman"/>
           <w:b/>
           <w:bCs/>
           <w:sz w:val="22"/>
@@ -1602,6 +1764,7 @@
       </w:r>
       <w:r>
         <w:rPr>
+          <w:rFonts w:ascii="Times New Roman" w:hAnsi="Times New Roman" w:cs="Times New Roman"/>
           <w:sz w:val="22"/>
           <w:szCs w:val="22"/>
         </w:rPr>
@@ -1614,12 +1777,14 @@
         <w:spacing w:after="0"/>
         <w:ind w:left="-454" w:right="-454"/>
         <w:rPr>
-          <w:sz w:val="22"/>
-          <w:szCs w:val="22"/>
-        </w:rPr>
-      </w:pPr>
-      <w:r>
-        <w:rPr>
+          <w:rFonts w:ascii="Times New Roman" w:hAnsi="Times New Roman" w:cs="Times New Roman"/>
+          <w:sz w:val="22"/>
+          <w:szCs w:val="22"/>
+        </w:rPr>
+      </w:pPr>
+      <w:r>
+        <w:rPr>
+          <w:rFonts w:ascii="Times New Roman" w:hAnsi="Times New Roman" w:cs="Times New Roman"/>
           <w:b/>
           <w:bCs/>
           <w:sz w:val="22"/>
@@ -1637,7 +1802,7 @@
         </w:numPr>
         <w:spacing w:after="0" w:line="240" w:lineRule="auto"/>
         <w:rPr>
-          <w:rFonts w:eastAsia="Times New Roman" w:cstheme="minorHAnsi"/>
+          <w:rFonts w:ascii="Times New Roman" w:eastAsia="Times New Roman" w:hAnsi="Times New Roman" w:cs="Times New Roman"/>
           <w:kern w:val="0"/>
           <w:sz w:val="22"/>
           <w:szCs w:val="22"/>
@@ -1647,7 +1812,7 @@
       </w:pPr>
       <w:r>
         <w:rPr>
-          <w:rFonts w:eastAsia="Times New Roman" w:cstheme="minorHAnsi"/>
+          <w:rFonts w:ascii="Times New Roman" w:eastAsia="Times New Roman" w:hAnsi="Times New Roman" w:cs="Times New Roman"/>
           <w:kern w:val="0"/>
           <w:sz w:val="22"/>
           <w:szCs w:val="22"/>
@@ -1658,7 +1823,7 @@
       </w:r>
       <w:r>
         <w:rPr>
-          <w:rFonts w:eastAsia="Times New Roman" w:cstheme="minorHAnsi"/>
+          <w:rFonts w:ascii="Times New Roman" w:eastAsia="Times New Roman" w:hAnsi="Times New Roman" w:cs="Times New Roman"/>
           <w:b/>
           <w:bCs/>
           <w:kern w:val="0"/>
@@ -1671,7 +1836,7 @@
       </w:r>
       <w:r>
         <w:rPr>
-          <w:rFonts w:eastAsia="Times New Roman" w:cstheme="minorHAnsi"/>
+          <w:rFonts w:ascii="Times New Roman" w:eastAsia="Times New Roman" w:hAnsi="Times New Roman" w:cs="Times New Roman"/>
           <w:kern w:val="0"/>
           <w:sz w:val="22"/>
           <w:szCs w:val="22"/>
@@ -1690,7 +1855,7 @@
         </w:numPr>
         <w:spacing w:after="0" w:line="240" w:lineRule="auto"/>
         <w:rPr>
-          <w:rFonts w:eastAsia="Times New Roman" w:cstheme="minorHAnsi"/>
+          <w:rFonts w:ascii="Times New Roman" w:eastAsia="Times New Roman" w:hAnsi="Times New Roman" w:cs="Times New Roman"/>
           <w:kern w:val="0"/>
           <w:sz w:val="22"/>
           <w:szCs w:val="22"/>
@@ -1700,7 +1865,7 @@
       </w:pPr>
       <w:r>
         <w:rPr>
-          <w:rFonts w:eastAsia="Times New Roman" w:cstheme="minorHAnsi"/>
+          <w:rFonts w:ascii="Times New Roman" w:eastAsia="Times New Roman" w:hAnsi="Times New Roman" w:cs="Times New Roman"/>
           <w:kern w:val="0"/>
           <w:sz w:val="22"/>
           <w:szCs w:val="22"/>
@@ -1711,7 +1876,7 @@
       </w:r>
       <w:r>
         <w:rPr>
-          <w:rFonts w:eastAsia="Times New Roman" w:cstheme="minorHAnsi"/>
+          <w:rFonts w:ascii="Times New Roman" w:eastAsia="Times New Roman" w:hAnsi="Times New Roman" w:cs="Times New Roman"/>
           <w:b/>
           <w:bCs/>
           <w:kern w:val="0"/>
@@ -1724,7 +1889,7 @@
       </w:r>
       <w:r>
         <w:rPr>
-          <w:rFonts w:eastAsia="Times New Roman" w:cstheme="minorHAnsi"/>
+          <w:rFonts w:ascii="Times New Roman" w:eastAsia="Times New Roman" w:hAnsi="Times New Roman" w:cs="Times New Roman"/>
           <w:kern w:val="0"/>
           <w:sz w:val="22"/>
           <w:szCs w:val="22"/>
@@ -1732,6 +1897,86 @@
           <w14:ligatures w14:val="none"/>
         </w:rPr>
         <w:t xml:space="preserve"> for complex, data-driven dashboards.</w:t>
+      </w:r>
+    </w:p>
+    <w:p>
+      <w:pPr>
+        <w:pStyle w:val="ListParagraph"/>
+        <w:numPr>
+          <w:ilvl w:val="0"/>
+          <w:numId w:val="14"/>
+        </w:numPr>
+        <w:rPr>
+          <w:rFonts w:ascii="Times New Roman" w:eastAsia="Times New Roman" w:hAnsi="Times New Roman" w:cs="Times New Roman"/>
+          <w:kern w:val="0"/>
+          <w:sz w:val="22"/>
+          <w:szCs w:val="22"/>
+          <w:lang w:eastAsia="en-IN"/>
+          <w14:ligatures w14:val="none"/>
+        </w:rPr>
+      </w:pPr>
+      <w:r>
+        <w:rPr>
+          <w:rFonts w:ascii="Times New Roman" w:eastAsia="Times New Roman" w:hAnsi="Times New Roman" w:cs="Times New Roman"/>
+          <w:kern w:val="0"/>
+          <w:sz w:val="22"/>
+          <w:szCs w:val="22"/>
+          <w:lang w:eastAsia="en-IN"/>
+          <w14:ligatures w14:val="none"/>
+        </w:rPr>
+        <w:t xml:space="preserve">Developed </w:t>
+      </w:r>
+      <w:r>
+        <w:rPr>
+          <w:rFonts w:ascii="Times New Roman" w:eastAsia="Times New Roman" w:hAnsi="Times New Roman" w:cs="Times New Roman"/>
+          <w:b/>
+          <w:bCs/>
+          <w:kern w:val="0"/>
+          <w:sz w:val="22"/>
+          <w:szCs w:val="22"/>
+          <w:lang w:eastAsia="en-IN"/>
+          <w14:ligatures w14:val="none"/>
+        </w:rPr>
+        <w:t>mobile-first, WCAG 2.1 compliant UI</w:t>
+      </w:r>
+      <w:r>
+        <w:rPr>
+          <w:rFonts w:ascii="Times New Roman" w:eastAsia="Times New Roman" w:hAnsi="Times New Roman" w:cs="Times New Roman"/>
+          <w:kern w:val="0"/>
+          <w:sz w:val="22"/>
+          <w:szCs w:val="22"/>
+          <w:lang w:eastAsia="en-IN"/>
+          <w14:ligatures w14:val="none"/>
+        </w:rPr>
+        <w:t xml:space="preserve"> for accessibility and cross-device support.</w:t>
+      </w:r>
+    </w:p>
+    <w:p>
+      <w:pPr>
+        <w:pStyle w:val="ListParagraph"/>
+        <w:numPr>
+          <w:ilvl w:val="0"/>
+          <w:numId w:val="14"/>
+        </w:numPr>
+        <w:rPr>
+          <w:rFonts w:ascii="Times New Roman" w:eastAsia="Times New Roman" w:hAnsi="Times New Roman" w:cs="Times New Roman"/>
+          <w:kern w:val="0"/>
+          <w:sz w:val="22"/>
+          <w:szCs w:val="22"/>
+          <w:lang w:eastAsia="en-IN"/>
+          <w14:ligatures w14:val="none"/>
+        </w:rPr>
+      </w:pPr>
+      <w:r>
+        <w:rPr>
+          <w:rFonts w:ascii="Times New Roman" w:eastAsia="Times New Roman" w:hAnsi="Times New Roman" w:cs="Times New Roman"/>
+          <w:kern w:val="0"/>
+          <w:sz w:val="22"/>
+          <w:szCs w:val="22"/>
+          <w:lang w:eastAsia="en-IN"/>
+          <w14:ligatures w14:val="none"/>
+        </w:rPr>
+        <w:t>Enhanced dashboard performance and scalability for global users across 140+ countries through NgRx and modular architecture.</w:t>
       </w:r>
     </w:p>
     <w:p>
@@ -1743,7 +1988,7 @@
         </w:numPr>
         <w:spacing w:after="0" w:line="240" w:lineRule="auto"/>
         <w:rPr>
-          <w:rFonts w:eastAsia="Times New Roman" w:cstheme="minorHAnsi"/>
+          <w:rFonts w:ascii="Times New Roman" w:eastAsia="Times New Roman" w:hAnsi="Times New Roman" w:cs="Times New Roman"/>
           <w:kern w:val="0"/>
           <w:sz w:val="22"/>
           <w:szCs w:val="22"/>
@@ -1753,18 +1998,18 @@
       </w:pPr>
       <w:r>
         <w:rPr>
-          <w:rFonts w:eastAsia="Times New Roman" w:cstheme="minorHAnsi"/>
+          <w:rFonts w:ascii="Times New Roman" w:eastAsia="Times New Roman" w:hAnsi="Times New Roman" w:cs="Times New Roman"/>
           <w:kern w:val="0"/>
           <w:sz w:val="22"/>
           <w:szCs w:val="22"/>
           <w:lang w:eastAsia="en-IN"/>
           <w14:ligatures w14:val="none"/>
         </w:rPr>
-        <w:t xml:space="preserve">Developed </w:t>
-      </w:r>
-      <w:r>
-        <w:rPr>
-          <w:rFonts w:eastAsia="Times New Roman" w:cstheme="minorHAnsi"/>
+        <w:t xml:space="preserve">Enabled </w:t>
+      </w:r>
+      <w:r>
+        <w:rPr>
+          <w:rFonts w:ascii="Times New Roman" w:eastAsia="Times New Roman" w:hAnsi="Times New Roman" w:cs="Times New Roman"/>
           <w:b/>
           <w:bCs/>
           <w:kern w:val="0"/>
@@ -1773,18 +2018,42 @@
           <w:lang w:eastAsia="en-IN"/>
           <w14:ligatures w14:val="none"/>
         </w:rPr>
-        <w:t>mobile-first, WCAG 2.1 compliant UI</w:t>
-      </w:r>
-      <w:r>
-        <w:rPr>
-          <w:rFonts w:eastAsia="Times New Roman" w:cstheme="minorHAnsi"/>
+        <w:t>multilingual and RTL support</w:t>
+      </w:r>
+      <w:r>
+        <w:rPr>
+          <w:rFonts w:ascii="Times New Roman" w:eastAsia="Times New Roman" w:hAnsi="Times New Roman" w:cs="Times New Roman"/>
           <w:kern w:val="0"/>
           <w:sz w:val="22"/>
           <w:szCs w:val="22"/>
           <w:lang w:eastAsia="en-IN"/>
           <w14:ligatures w14:val="none"/>
         </w:rPr>
-        <w:t xml:space="preserve"> for accessibility and cross-device support.</w:t>
+        <w:t xml:space="preserve">, driving adoption across </w:t>
+      </w:r>
+      <w:r>
+        <w:rPr>
+          <w:rFonts w:ascii="Times New Roman" w:eastAsia="Times New Roman" w:hAnsi="Times New Roman" w:cs="Times New Roman"/>
+          <w:b/>
+          <w:bCs/>
+          <w:kern w:val="0"/>
+          <w:sz w:val="22"/>
+          <w:szCs w:val="22"/>
+          <w:lang w:eastAsia="en-IN"/>
+          <w14:ligatures w14:val="none"/>
+        </w:rPr>
+        <w:t>140+ countries</w:t>
+      </w:r>
+      <w:r>
+        <w:rPr>
+          <w:rFonts w:ascii="Times New Roman" w:eastAsia="Times New Roman" w:hAnsi="Times New Roman" w:cs="Times New Roman"/>
+          <w:kern w:val="0"/>
+          <w:sz w:val="22"/>
+          <w:szCs w:val="22"/>
+          <w:lang w:eastAsia="en-IN"/>
+          <w14:ligatures w14:val="none"/>
+        </w:rPr>
+        <w:t>.</w:t>
       </w:r>
     </w:p>
     <w:p>
@@ -1796,7 +2065,7 @@
         </w:numPr>
         <w:spacing w:after="0" w:line="240" w:lineRule="auto"/>
         <w:rPr>
-          <w:rFonts w:eastAsia="Times New Roman" w:cstheme="minorHAnsi"/>
+          <w:rFonts w:ascii="Times New Roman" w:eastAsia="Times New Roman" w:hAnsi="Times New Roman" w:cs="Times New Roman"/>
           <w:kern w:val="0"/>
           <w:sz w:val="22"/>
           <w:szCs w:val="22"/>
@@ -1806,18 +2075,18 @@
       </w:pPr>
       <w:r>
         <w:rPr>
-          <w:rFonts w:eastAsia="Times New Roman" w:cstheme="minorHAnsi"/>
+          <w:rFonts w:ascii="Times New Roman" w:eastAsia="Times New Roman" w:hAnsi="Times New Roman" w:cs="Times New Roman"/>
           <w:kern w:val="0"/>
           <w:sz w:val="22"/>
           <w:szCs w:val="22"/>
           <w:lang w:eastAsia="en-IN"/>
           <w14:ligatures w14:val="none"/>
         </w:rPr>
-        <w:t xml:space="preserve">Enabled </w:t>
-      </w:r>
-      <w:r>
-        <w:rPr>
-          <w:rFonts w:eastAsia="Times New Roman" w:cstheme="minorHAnsi"/>
+        <w:t xml:space="preserve">Improved application performance using </w:t>
+      </w:r>
+      <w:r>
+        <w:rPr>
+          <w:rFonts w:ascii="Times New Roman" w:eastAsia="Times New Roman" w:hAnsi="Times New Roman" w:cs="Times New Roman"/>
           <w:b/>
           <w:bCs/>
           <w:kern w:val="0"/>
@@ -1826,356 +2095,99 @@
           <w:lang w:eastAsia="en-IN"/>
           <w14:ligatures w14:val="none"/>
         </w:rPr>
-        <w:t>multilingual and RTL support</w:t>
-      </w:r>
-      <w:r>
-        <w:rPr>
-          <w:rFonts w:eastAsia="Times New Roman" w:cstheme="minorHAnsi"/>
+        <w:t>lazy loading, modular architecture, and optimization techniques</w:t>
+      </w:r>
+      <w:r>
+        <w:rPr>
+          <w:rFonts w:ascii="Times New Roman" w:eastAsia="Times New Roman" w:hAnsi="Times New Roman" w:cs="Times New Roman"/>
           <w:kern w:val="0"/>
           <w:sz w:val="22"/>
           <w:szCs w:val="22"/>
           <w:lang w:eastAsia="en-IN"/>
           <w14:ligatures w14:val="none"/>
         </w:rPr>
-        <w:t xml:space="preserve">, driving adoption across </w:t>
-      </w:r>
-      <w:r>
-        <w:rPr>
-          <w:rFonts w:eastAsia="Times New Roman" w:cstheme="minorHAnsi"/>
-          <w:b/>
-          <w:bCs/>
-          <w:kern w:val="0"/>
-          <w:sz w:val="22"/>
-          <w:szCs w:val="22"/>
-          <w:lang w:eastAsia="en-IN"/>
-          <w14:ligatures w14:val="none"/>
-        </w:rPr>
-        <w:t>140+ countries</w:t>
-      </w:r>
-      <w:r>
-        <w:rPr>
-          <w:rFonts w:eastAsia="Times New Roman" w:cstheme="minorHAnsi"/>
-          <w:kern w:val="0"/>
-          <w:sz w:val="22"/>
-          <w:szCs w:val="22"/>
-          <w:lang w:eastAsia="en-IN"/>
-          <w14:ligatures w14:val="none"/>
-        </w:rPr>
         <w:t>.</w:t>
       </w:r>
     </w:p>
     <w:p>
       <w:pPr>
-        <w:pStyle w:val="ListParagraph"/>
-        <w:numPr>
-          <w:ilvl w:val="0"/>
-          <w:numId w:val="14"/>
-        </w:numPr>
-        <w:spacing w:after="0" w:line="240" w:lineRule="auto"/>
-        <w:rPr>
-          <w:rFonts w:eastAsia="Times New Roman" w:cstheme="minorHAnsi"/>
-          <w:kern w:val="0"/>
-          <w:sz w:val="22"/>
-          <w:szCs w:val="22"/>
-          <w:lang w:eastAsia="en-IN"/>
-          <w14:ligatures w14:val="none"/>
-        </w:rPr>
-      </w:pPr>
-      <w:r>
-        <w:rPr>
-          <w:rFonts w:eastAsia="Times New Roman" w:cstheme="minorHAnsi"/>
-          <w:kern w:val="0"/>
-          <w:sz w:val="22"/>
-          <w:szCs w:val="22"/>
-          <w:lang w:eastAsia="en-IN"/>
-          <w14:ligatures w14:val="none"/>
-        </w:rPr>
-        <w:t xml:space="preserve">Improved application performance using </w:t>
-      </w:r>
-      <w:r>
-        <w:rPr>
-          <w:rFonts w:eastAsia="Times New Roman" w:cstheme="minorHAnsi"/>
-          <w:b/>
-          <w:bCs/>
-          <w:kern w:val="0"/>
-          <w:sz w:val="22"/>
-          <w:szCs w:val="22"/>
-          <w:lang w:eastAsia="en-IN"/>
-          <w14:ligatures w14:val="none"/>
-        </w:rPr>
-        <w:t>lazy loading, modular architecture, and optimization techniques</w:t>
-      </w:r>
-      <w:r>
-        <w:rPr>
-          <w:rFonts w:eastAsia="Times New Roman" w:cstheme="minorHAnsi"/>
-          <w:kern w:val="0"/>
-          <w:sz w:val="22"/>
-          <w:szCs w:val="22"/>
-          <w:lang w:eastAsia="en-IN"/>
-          <w14:ligatures w14:val="none"/>
-        </w:rPr>
-        <w:t>.</w:t>
-      </w:r>
+        <w:spacing w:after="0"/>
+        <w:ind w:right="-454"/>
+        <w:rPr>
+          <w:rFonts w:ascii="Times New Roman" w:hAnsi="Times New Roman" w:cs="Times New Roman"/>
+        </w:rPr>
+      </w:pPr>
     </w:p>
     <w:p>
       <w:pPr>
-        <w:pStyle w:val="ListParagraph"/>
-        <w:numPr>
-          <w:ilvl w:val="0"/>
-          <w:numId w:val="14"/>
-        </w:numPr>
-        <w:spacing w:after="0" w:line="240" w:lineRule="auto"/>
-        <w:rPr>
-          <w:rFonts w:eastAsia="Times New Roman" w:cstheme="minorHAnsi"/>
-          <w:kern w:val="0"/>
-          <w:sz w:val="22"/>
-          <w:szCs w:val="22"/>
-          <w:lang w:eastAsia="en-IN"/>
-          <w14:ligatures w14:val="none"/>
-        </w:rPr>
-      </w:pPr>
-      <w:r>
-        <w:rPr>
-          <w:rFonts w:eastAsia="Times New Roman" w:cstheme="minorHAnsi"/>
-          <w:kern w:val="0"/>
-          <w:sz w:val="22"/>
-          <w:szCs w:val="22"/>
-          <w:lang w:eastAsia="en-IN"/>
-          <w14:ligatures w14:val="none"/>
-        </w:rPr>
-        <w:t>Supported Angular version upgrades and long-term maintainability initiatives.</w:t>
+        <w:ind w:left="-454" w:right="-454"/>
+        <w:rPr>
+          <w:rFonts w:ascii="Times New Roman" w:hAnsi="Times New Roman" w:cs="Times New Roman"/>
+          <w:b/>
+          <w:bCs/>
+          <w:color w:val="000000" w:themeColor="text1"/>
+          <w:sz w:val="26"/>
+          <w:szCs w:val="26"/>
+        </w:rPr>
+      </w:pPr>
+      <w:r>
+        <w:rPr>
+          <w:rFonts w:ascii="Times New Roman" w:hAnsi="Times New Roman" w:cs="Times New Roman"/>
+          <w:b/>
+          <w:bCs/>
+          <w:color w:val="000000" w:themeColor="text1"/>
+          <w:sz w:val="26"/>
+          <w:szCs w:val="26"/>
+        </w:rPr>
+        <w:t>EDUCATION</w:t>
       </w:r>
     </w:p>
     <w:p>
       <w:pPr>
         <w:ind w:left="-454" w:right="-454"/>
         <w:rPr>
-          <w:sz w:val="22"/>
-          <w:szCs w:val="22"/>
-        </w:rPr>
-      </w:pPr>
-      <w:r>
-        <w:rPr>
-          <w:sz w:val="22"/>
-          <w:szCs w:val="22"/>
-        </w:rPr>
-        <w:pict w14:anchorId="3502168E">
-          <v:rect id="_x0000_i1029" style="width:0;height:1.5pt" o:hralign="center" o:hrstd="t" o:hr="t" fillcolor="#a0a0a0" stroked="f"/>
-        </w:pict>
-      </w:r>
-    </w:p>
-    <w:p>
-      <w:pPr>
-        <w:ind w:left="-454" w:right="-454"/>
-        <w:rPr>
-          <w:b/>
-          <w:bCs/>
-          <w:color w:val="4472C4" w:themeColor="accent1"/>
-          <w:sz w:val="22"/>
-          <w:szCs w:val="22"/>
-        </w:rPr>
-      </w:pPr>
-      <w:r>
-        <w:rPr>
-          <w:b/>
-          <w:bCs/>
-          <w:color w:val="4472C4" w:themeColor="accent1"/>
-          <w:sz w:val="22"/>
-          <w:szCs w:val="22"/>
-        </w:rPr>
-        <w:t>KEY ACHIEVEMENTS</w:t>
-      </w:r>
-    </w:p>
-    <w:p>
-      <w:pPr>
-        <w:pStyle w:val="ListParagraph"/>
-        <w:numPr>
-          <w:ilvl w:val="0"/>
-          <w:numId w:val="15"/>
-        </w:numPr>
-        <w:spacing w:after="0"/>
-        <w:ind w:right="-454"/>
-        <w:rPr>
-          <w:sz w:val="22"/>
-          <w:szCs w:val="22"/>
-        </w:rPr>
-      </w:pPr>
-      <w:r>
-        <w:rPr>
-          <w:sz w:val="22"/>
-          <w:szCs w:val="22"/>
-        </w:rPr>
-        <w:t xml:space="preserve">Improved application load time by </w:t>
-      </w:r>
-      <w:r>
-        <w:rPr>
-          <w:b/>
-          <w:bCs/>
-          <w:sz w:val="22"/>
-          <w:szCs w:val="22"/>
-        </w:rPr>
-        <w:t>30%</w:t>
-      </w:r>
-      <w:r>
-        <w:rPr>
-          <w:sz w:val="22"/>
-          <w:szCs w:val="22"/>
-        </w:rPr>
-        <w:t xml:space="preserve"> through modular architecture and performance tuning.</w:t>
-      </w:r>
-    </w:p>
-    <w:p>
-      <w:pPr>
-        <w:pStyle w:val="ListParagraph"/>
-        <w:numPr>
-          <w:ilvl w:val="0"/>
-          <w:numId w:val="15"/>
-        </w:numPr>
-        <w:spacing w:after="0"/>
-        <w:ind w:right="-454"/>
-        <w:rPr>
-          <w:sz w:val="22"/>
-          <w:szCs w:val="22"/>
-        </w:rPr>
-      </w:pPr>
-      <w:r>
-        <w:rPr>
-          <w:sz w:val="22"/>
-          <w:szCs w:val="22"/>
-        </w:rPr>
-        <w:t xml:space="preserve">Contributed to </w:t>
-      </w:r>
-      <w:r>
-        <w:rPr>
-          <w:b/>
-          <w:bCs/>
-          <w:sz w:val="22"/>
-          <w:szCs w:val="22"/>
-        </w:rPr>
-        <w:t>large-scale Angular modernization</w:t>
-      </w:r>
-      <w:r>
-        <w:rPr>
-          <w:sz w:val="22"/>
-          <w:szCs w:val="22"/>
-        </w:rPr>
-        <w:t xml:space="preserve"> for mission-critical systems.</w:t>
-      </w:r>
-    </w:p>
-    <w:p>
-      <w:pPr>
-        <w:pStyle w:val="ListParagraph"/>
-        <w:numPr>
-          <w:ilvl w:val="0"/>
-          <w:numId w:val="15"/>
-        </w:numPr>
-        <w:spacing w:after="0"/>
-        <w:ind w:right="-454"/>
-        <w:rPr>
-          <w:sz w:val="22"/>
-          <w:szCs w:val="22"/>
-        </w:rPr>
-      </w:pPr>
-      <w:r>
-        <w:rPr>
-          <w:sz w:val="22"/>
-          <w:szCs w:val="22"/>
-        </w:rPr>
-        <w:t xml:space="preserve">Delivered multilingual enterprise platforms adopted across </w:t>
-      </w:r>
-      <w:r>
-        <w:rPr>
-          <w:b/>
-          <w:bCs/>
-          <w:sz w:val="22"/>
-          <w:szCs w:val="22"/>
-        </w:rPr>
-        <w:t>140+ countries</w:t>
-      </w:r>
-      <w:r>
-        <w:rPr>
+          <w:rFonts w:ascii="Times New Roman" w:hAnsi="Times New Roman" w:cs="Times New Roman"/>
+          <w:sz w:val="22"/>
+          <w:szCs w:val="22"/>
+        </w:rPr>
+      </w:pPr>
+      <w:r>
+        <w:rPr>
+          <w:rFonts w:ascii="Times New Roman" w:hAnsi="Times New Roman" w:cs="Times New Roman"/>
+          <w:sz w:val="22"/>
+          <w:szCs w:val="22"/>
+        </w:rPr>
+        <w:t>Bachelor of Technology (B</w:t>
+      </w:r>
+      <w:r>
+        <w:rPr>
+          <w:rFonts w:ascii="Times New Roman" w:hAnsi="Times New Roman" w:cs="Times New Roman"/>
           <w:sz w:val="22"/>
           <w:szCs w:val="22"/>
         </w:rPr>
         <w:t>.</w:t>
       </w:r>
-    </w:p>
-    <w:p>
-      <w:pPr>
-        <w:ind w:left="-454" w:right="-454"/>
-        <w:rPr>
-          <w:sz w:val="22"/>
-          <w:szCs w:val="22"/>
-        </w:rPr>
-      </w:pPr>
-      <w:r>
-        <w:rPr>
-          <w:sz w:val="22"/>
-          <w:szCs w:val="22"/>
-        </w:rPr>
-        <w:pict w14:anchorId="2C281FA7">
-          <v:rect id="_x0000_i1030" style="width:0;height:1.5pt" o:hralign="center" o:hrstd="t" o:hr="t" fillcolor="#a0a0a0" stroked="f"/>
-        </w:pict>
-      </w:r>
-    </w:p>
-    <w:p>
-      <w:pPr>
-        <w:ind w:left="-454" w:right="-454"/>
-        <w:rPr>
-          <w:b/>
-          <w:bCs/>
-          <w:color w:val="4472C4" w:themeColor="accent1"/>
-          <w:sz w:val="22"/>
-          <w:szCs w:val="22"/>
-        </w:rPr>
-      </w:pPr>
-      <w:r>
-        <w:rPr>
-          <w:b/>
-          <w:bCs/>
-          <w:color w:val="4472C4" w:themeColor="accent1"/>
-          <w:sz w:val="22"/>
-          <w:szCs w:val="22"/>
-        </w:rPr>
-        <w:t>EDUCATION</w:t>
-      </w:r>
-    </w:p>
-    <w:p>
-      <w:pPr>
-        <w:ind w:left="-454" w:right="-454"/>
-        <w:rPr>
-          <w:sz w:val="22"/>
-          <w:szCs w:val="22"/>
-        </w:rPr>
-      </w:pPr>
-      <w:r>
-        <w:rPr>
-          <w:sz w:val="22"/>
-          <w:szCs w:val="22"/>
-        </w:rPr>
-        <w:t>Bachelor of Technology (B.Tech) – Computer Science</w:t>
-      </w:r>
-      <w:r>
-        <w:rPr>
+      <w:r>
+        <w:rPr>
+          <w:rFonts w:ascii="Times New Roman" w:hAnsi="Times New Roman" w:cs="Times New Roman"/>
+          <w:sz w:val="22"/>
+          <w:szCs w:val="22"/>
+        </w:rPr>
+        <w:t>Tech) – Computer Science</w:t>
+      </w:r>
+      <w:r>
+        <w:rPr>
+          <w:rFonts w:ascii="Times New Roman" w:hAnsi="Times New Roman" w:cs="Times New Roman"/>
           <w:sz w:val="22"/>
           <w:szCs w:val="22"/>
         </w:rPr>
         <w:br/>
         <w:t>Amity School of Engineering &amp; Technology, Noida | 2019</w:t>
       </w:r>
-    </w:p>
-    <w:p>
-      <w:pPr>
-        <w:ind w:left="-454" w:right="-454"/>
-        <w:rPr>
-          <w:sz w:val="22"/>
-          <w:szCs w:val="22"/>
-        </w:rPr>
-      </w:pPr>
     </w:p>
     <w:sectPr>
       <w:pgSz w:w="11906" w:h="16838"/>
-      <w:pgMar w:top="851" w:right="1440" w:bottom="709" w:left="1440" w:header="708" w:footer="708" w:gutter="0"/>
+      <w:pgMar w:top="709" w:right="1440" w:bottom="709" w:left="1440" w:header="708" w:footer="708" w:gutter="0"/>
       <w:cols w:space="708"/>
       <w:docGrid w:linePitch="360"/>
     </w:sectPr>
@@ -2931,6 +2943,345 @@
     </w:lvl>
   </w:abstractNum>
   <w:abstractNum w:abstractNumId="5" w15:restartNumberingAfterBreak="0">
+    <w:nsid w:val="1B3167A7"/>
+    <w:multiLevelType w:val="hybridMultilevel"/>
+    <w:tmpl w:val="788AB70E"/>
+    <w:lvl w:ilvl="0" w:tplc="40090001">
+      <w:start w:val="1"/>
+      <w:numFmt w:val="bullet"/>
+      <w:lvlText w:val=""/>
+      <w:lvlJc w:val="left"/>
+      <w:pPr>
+        <w:ind w:left="720" w:hanging="360"/>
+      </w:pPr>
+      <w:rPr>
+        <w:rFonts w:ascii="Symbol" w:hAnsi="Symbol" w:hint="default"/>
+      </w:rPr>
+    </w:lvl>
+    <w:lvl w:ilvl="1" w:tplc="40090003" w:tentative="1">
+      <w:start w:val="1"/>
+      <w:numFmt w:val="bullet"/>
+      <w:lvlText w:val="o"/>
+      <w:lvlJc w:val="left"/>
+      <w:pPr>
+        <w:ind w:left="1440" w:hanging="360"/>
+      </w:pPr>
+      <w:rPr>
+        <w:rFonts w:ascii="Courier New" w:hAnsi="Courier New" w:cs="Courier New" w:hint="default"/>
+      </w:rPr>
+    </w:lvl>
+    <w:lvl w:ilvl="2" w:tplc="40090005" w:tentative="1">
+      <w:start w:val="1"/>
+      <w:numFmt w:val="bullet"/>
+      <w:lvlText w:val=""/>
+      <w:lvlJc w:val="left"/>
+      <w:pPr>
+        <w:ind w:left="2160" w:hanging="360"/>
+      </w:pPr>
+      <w:rPr>
+        <w:rFonts w:ascii="Wingdings" w:hAnsi="Wingdings" w:hint="default"/>
+      </w:rPr>
+    </w:lvl>
+    <w:lvl w:ilvl="3" w:tplc="40090001" w:tentative="1">
+      <w:start w:val="1"/>
+      <w:numFmt w:val="bullet"/>
+      <w:lvlText w:val=""/>
+      <w:lvlJc w:val="left"/>
+      <w:pPr>
+        <w:ind w:left="2880" w:hanging="360"/>
+      </w:pPr>
+      <w:rPr>
+        <w:rFonts w:ascii="Symbol" w:hAnsi="Symbol" w:hint="default"/>
+      </w:rPr>
+    </w:lvl>
+    <w:lvl w:ilvl="4" w:tplc="40090003" w:tentative="1">
+      <w:start w:val="1"/>
+      <w:numFmt w:val="bullet"/>
+      <w:lvlText w:val="o"/>
+      <w:lvlJc w:val="left"/>
+      <w:pPr>
+        <w:ind w:left="3600" w:hanging="360"/>
+      </w:pPr>
+      <w:rPr>
+        <w:rFonts w:ascii="Courier New" w:hAnsi="Courier New" w:cs="Courier New" w:hint="default"/>
+      </w:rPr>
+    </w:lvl>
+    <w:lvl w:ilvl="5" w:tplc="40090005" w:tentative="1">
+      <w:start w:val="1"/>
+      <w:numFmt w:val="bullet"/>
+      <w:lvlText w:val=""/>
+      <w:lvlJc w:val="left"/>
+      <w:pPr>
+        <w:ind w:left="4320" w:hanging="360"/>
+      </w:pPr>
+      <w:rPr>
+        <w:rFonts w:ascii="Wingdings" w:hAnsi="Wingdings" w:hint="default"/>
+      </w:rPr>
+    </w:lvl>
+    <w:lvl w:ilvl="6" w:tplc="40090001" w:tentative="1">
+      <w:start w:val="1"/>
+      <w:numFmt w:val="bullet"/>
+      <w:lvlText w:val=""/>
+      <w:lvlJc w:val="left"/>
+      <w:pPr>
+        <w:ind w:left="5040" w:hanging="360"/>
+      </w:pPr>
+      <w:rPr>
+        <w:rFonts w:ascii="Symbol" w:hAnsi="Symbol" w:hint="default"/>
+      </w:rPr>
+    </w:lvl>
+    <w:lvl w:ilvl="7" w:tplc="40090003" w:tentative="1">
+      <w:start w:val="1"/>
+      <w:numFmt w:val="bullet"/>
+      <w:lvlText w:val="o"/>
+      <w:lvlJc w:val="left"/>
+      <w:pPr>
+        <w:ind w:left="5760" w:hanging="360"/>
+      </w:pPr>
+      <w:rPr>
+        <w:rFonts w:ascii="Courier New" w:hAnsi="Courier New" w:cs="Courier New" w:hint="default"/>
+      </w:rPr>
+    </w:lvl>
+    <w:lvl w:ilvl="8" w:tplc="40090005" w:tentative="1">
+      <w:start w:val="1"/>
+      <w:numFmt w:val="bullet"/>
+      <w:lvlText w:val=""/>
+      <w:lvlJc w:val="left"/>
+      <w:pPr>
+        <w:ind w:left="6480" w:hanging="360"/>
+      </w:pPr>
+      <w:rPr>
+        <w:rFonts w:ascii="Wingdings" w:hAnsi="Wingdings" w:hint="default"/>
+      </w:rPr>
+    </w:lvl>
+  </w:abstractNum>
+  <w:abstractNum w:abstractNumId="6" w15:restartNumberingAfterBreak="0">
+    <w:nsid w:val="212D7A36"/>
+    <w:multiLevelType w:val="hybridMultilevel"/>
+    <w:tmpl w:val="9774AC10"/>
+    <w:lvl w:ilvl="0" w:tplc="40090001">
+      <w:start w:val="1"/>
+      <w:numFmt w:val="bullet"/>
+      <w:lvlText w:val=""/>
+      <w:lvlJc w:val="left"/>
+      <w:pPr>
+        <w:ind w:left="360" w:hanging="360"/>
+      </w:pPr>
+      <w:rPr>
+        <w:rFonts w:ascii="Symbol" w:hAnsi="Symbol" w:hint="default"/>
+      </w:rPr>
+    </w:lvl>
+    <w:lvl w:ilvl="1" w:tplc="40090003" w:tentative="1">
+      <w:start w:val="1"/>
+      <w:numFmt w:val="bullet"/>
+      <w:lvlText w:val="o"/>
+      <w:lvlJc w:val="left"/>
+      <w:pPr>
+        <w:ind w:left="1080" w:hanging="360"/>
+      </w:pPr>
+      <w:rPr>
+        <w:rFonts w:ascii="Courier New" w:hAnsi="Courier New" w:cs="Courier New" w:hint="default"/>
+      </w:rPr>
+    </w:lvl>
+    <w:lvl w:ilvl="2" w:tplc="40090005" w:tentative="1">
+      <w:start w:val="1"/>
+      <w:numFmt w:val="bullet"/>
+      <w:lvlText w:val=""/>
+      <w:lvlJc w:val="left"/>
+      <w:pPr>
+        <w:ind w:left="1800" w:hanging="360"/>
+      </w:pPr>
+      <w:rPr>
+        <w:rFonts w:ascii="Wingdings" w:hAnsi="Wingdings" w:hint="default"/>
+      </w:rPr>
+    </w:lvl>
+    <w:lvl w:ilvl="3" w:tplc="40090001" w:tentative="1">
+      <w:start w:val="1"/>
+      <w:numFmt w:val="bullet"/>
+      <w:lvlText w:val=""/>
+      <w:lvlJc w:val="left"/>
+      <w:pPr>
+        <w:ind w:left="2520" w:hanging="360"/>
+      </w:pPr>
+      <w:rPr>
+        <w:rFonts w:ascii="Symbol" w:hAnsi="Symbol" w:hint="default"/>
+      </w:rPr>
+    </w:lvl>
+    <w:lvl w:ilvl="4" w:tplc="40090003" w:tentative="1">
+      <w:start w:val="1"/>
+      <w:numFmt w:val="bullet"/>
+      <w:lvlText w:val="o"/>
+      <w:lvlJc w:val="left"/>
+      <w:pPr>
+        <w:ind w:left="3240" w:hanging="360"/>
+      </w:pPr>
+      <w:rPr>
+        <w:rFonts w:ascii="Courier New" w:hAnsi="Courier New" w:cs="Courier New" w:hint="default"/>
+      </w:rPr>
+    </w:lvl>
+    <w:lvl w:ilvl="5" w:tplc="40090005" w:tentative="1">
+      <w:start w:val="1"/>
+      <w:numFmt w:val="bullet"/>
+      <w:lvlText w:val=""/>
+      <w:lvlJc w:val="left"/>
+      <w:pPr>
+        <w:ind w:left="3960" w:hanging="360"/>
+      </w:pPr>
+      <w:rPr>
+        <w:rFonts w:ascii="Wingdings" w:hAnsi="Wingdings" w:hint="default"/>
+      </w:rPr>
+    </w:lvl>
+    <w:lvl w:ilvl="6" w:tplc="40090001" w:tentative="1">
+      <w:start w:val="1"/>
+      <w:numFmt w:val="bullet"/>
+      <w:lvlText w:val=""/>
+      <w:lvlJc w:val="left"/>
+      <w:pPr>
+        <w:ind w:left="4680" w:hanging="360"/>
+      </w:pPr>
+      <w:rPr>
+        <w:rFonts w:ascii="Symbol" w:hAnsi="Symbol" w:hint="default"/>
+      </w:rPr>
+    </w:lvl>
+    <w:lvl w:ilvl="7" w:tplc="40090003" w:tentative="1">
+      <w:start w:val="1"/>
+      <w:numFmt w:val="bullet"/>
+      <w:lvlText w:val="o"/>
+      <w:lvlJc w:val="left"/>
+      <w:pPr>
+        <w:ind w:left="5400" w:hanging="360"/>
+      </w:pPr>
+      <w:rPr>
+        <w:rFonts w:ascii="Courier New" w:hAnsi="Courier New" w:cs="Courier New" w:hint="default"/>
+      </w:rPr>
+    </w:lvl>
+    <w:lvl w:ilvl="8" w:tplc="40090005" w:tentative="1">
+      <w:start w:val="1"/>
+      <w:numFmt w:val="bullet"/>
+      <w:lvlText w:val=""/>
+      <w:lvlJc w:val="left"/>
+      <w:pPr>
+        <w:ind w:left="6120" w:hanging="360"/>
+      </w:pPr>
+      <w:rPr>
+        <w:rFonts w:ascii="Wingdings" w:hAnsi="Wingdings" w:hint="default"/>
+      </w:rPr>
+    </w:lvl>
+  </w:abstractNum>
+  <w:abstractNum w:abstractNumId="7" w15:restartNumberingAfterBreak="0">
+    <w:nsid w:val="221A7B66"/>
+    <w:multiLevelType w:val="hybridMultilevel"/>
+    <w:tmpl w:val="8D5EE3E4"/>
+    <w:lvl w:ilvl="0" w:tplc="40090001">
+      <w:start w:val="1"/>
+      <w:numFmt w:val="bullet"/>
+      <w:lvlText w:val=""/>
+      <w:lvlJc w:val="left"/>
+      <w:pPr>
+        <w:ind w:left="360" w:hanging="360"/>
+      </w:pPr>
+      <w:rPr>
+        <w:rFonts w:ascii="Symbol" w:hAnsi="Symbol" w:hint="default"/>
+      </w:rPr>
+    </w:lvl>
+    <w:lvl w:ilvl="1" w:tplc="40090003" w:tentative="1">
+      <w:start w:val="1"/>
+      <w:numFmt w:val="bullet"/>
+      <w:lvlText w:val="o"/>
+      <w:lvlJc w:val="left"/>
+      <w:pPr>
+        <w:ind w:left="1080" w:hanging="360"/>
+      </w:pPr>
+      <w:rPr>
+        <w:rFonts w:ascii="Courier New" w:hAnsi="Courier New" w:cs="Courier New" w:hint="default"/>
+      </w:rPr>
+    </w:lvl>
+    <w:lvl w:ilvl="2" w:tplc="40090005" w:tentative="1">
+      <w:start w:val="1"/>
+      <w:numFmt w:val="bullet"/>
+      <w:lvlText w:val=""/>
+      <w:lvlJc w:val="left"/>
+      <w:pPr>
+        <w:ind w:left="1800" w:hanging="360"/>
+      </w:pPr>
+      <w:rPr>
+        <w:rFonts w:ascii="Wingdings" w:hAnsi="Wingdings" w:hint="default"/>
+      </w:rPr>
+    </w:lvl>
+    <w:lvl w:ilvl="3" w:tplc="40090001" w:tentative="1">
+      <w:start w:val="1"/>
+      <w:numFmt w:val="bullet"/>
+      <w:lvlText w:val=""/>
+      <w:lvlJc w:val="left"/>
+      <w:pPr>
+        <w:ind w:left="2520" w:hanging="360"/>
+      </w:pPr>
+      <w:rPr>
+        <w:rFonts w:ascii="Symbol" w:hAnsi="Symbol" w:hint="default"/>
+      </w:rPr>
+    </w:lvl>
+    <w:lvl w:ilvl="4" w:tplc="40090003" w:tentative="1">
+      <w:start w:val="1"/>
+      <w:numFmt w:val="bullet"/>
+      <w:lvlText w:val="o"/>
+      <w:lvlJc w:val="left"/>
+      <w:pPr>
+        <w:ind w:left="3240" w:hanging="360"/>
+      </w:pPr>
+      <w:rPr>
+        <w:rFonts w:ascii="Courier New" w:hAnsi="Courier New" w:cs="Courier New" w:hint="default"/>
+      </w:rPr>
+    </w:lvl>
+    <w:lvl w:ilvl="5" w:tplc="40090005" w:tentative="1">
+      <w:start w:val="1"/>
+      <w:numFmt w:val="bullet"/>
+      <w:lvlText w:val=""/>
+      <w:lvlJc w:val="left"/>
+      <w:pPr>
+        <w:ind w:left="3960" w:hanging="360"/>
+      </w:pPr>
+      <w:rPr>
+        <w:rFonts w:ascii="Wingdings" w:hAnsi="Wingdings" w:hint="default"/>
+      </w:rPr>
+    </w:lvl>
+    <w:lvl w:ilvl="6" w:tplc="40090001" w:tentative="1">
+      <w:start w:val="1"/>
+      <w:numFmt w:val="bullet"/>
+      <w:lvlText w:val=""/>
+      <w:lvlJc w:val="left"/>
+      <w:pPr>
+        <w:ind w:left="4680" w:hanging="360"/>
+      </w:pPr>
+      <w:rPr>
+        <w:rFonts w:ascii="Symbol" w:hAnsi="Symbol" w:hint="default"/>
+      </w:rPr>
+    </w:lvl>
+    <w:lvl w:ilvl="7" w:tplc="40090003" w:tentative="1">
+      <w:start w:val="1"/>
+      <w:numFmt w:val="bullet"/>
+      <w:lvlText w:val="o"/>
+      <w:lvlJc w:val="left"/>
+      <w:pPr>
+        <w:ind w:left="5400" w:hanging="360"/>
+      </w:pPr>
+      <w:rPr>
+        <w:rFonts w:ascii="Courier New" w:hAnsi="Courier New" w:cs="Courier New" w:hint="default"/>
+      </w:rPr>
+    </w:lvl>
+    <w:lvl w:ilvl="8" w:tplc="40090005" w:tentative="1">
+      <w:start w:val="1"/>
+      <w:numFmt w:val="bullet"/>
+      <w:lvlText w:val=""/>
+      <w:lvlJc w:val="left"/>
+      <w:pPr>
+        <w:ind w:left="6120" w:hanging="360"/>
+      </w:pPr>
+      <w:rPr>
+        <w:rFonts w:ascii="Wingdings" w:hAnsi="Wingdings" w:hint="default"/>
+      </w:rPr>
+    </w:lvl>
+  </w:abstractNum>
+  <w:abstractNum w:abstractNumId="8" w15:restartNumberingAfterBreak="0">
     <w:nsid w:val="26B17C01"/>
     <w:multiLevelType w:val="multilevel"/>
     <w:tmpl w:val="28F49EAA"/>
@@ -3079,7 +3430,7 @@
       </w:rPr>
     </w:lvl>
   </w:abstractNum>
-  <w:abstractNum w:abstractNumId="6" w15:restartNumberingAfterBreak="0">
+  <w:abstractNum w:abstractNumId="9" w15:restartNumberingAfterBreak="0">
     <w:nsid w:val="2BF50D11"/>
     <w:multiLevelType w:val="hybridMultilevel"/>
     <w:tmpl w:val="D5DCDD2E"/>
@@ -3192,7 +3543,7 @@
       </w:rPr>
     </w:lvl>
   </w:abstractNum>
-  <w:abstractNum w:abstractNumId="7" w15:restartNumberingAfterBreak="0">
+  <w:abstractNum w:abstractNumId="10" w15:restartNumberingAfterBreak="0">
     <w:nsid w:val="30236920"/>
     <w:multiLevelType w:val="multilevel"/>
     <w:tmpl w:val="6B44A0B0"/>
@@ -3341,7 +3692,7 @@
       </w:rPr>
     </w:lvl>
   </w:abstractNum>
-  <w:abstractNum w:abstractNumId="8" w15:restartNumberingAfterBreak="0">
+  <w:abstractNum w:abstractNumId="11" w15:restartNumberingAfterBreak="0">
     <w:nsid w:val="3260554F"/>
     <w:multiLevelType w:val="hybridMultilevel"/>
     <w:tmpl w:val="7F7ADA64"/>
@@ -3454,7 +3805,7 @@
       </w:rPr>
     </w:lvl>
   </w:abstractNum>
-  <w:abstractNum w:abstractNumId="9" w15:restartNumberingAfterBreak="0">
+  <w:abstractNum w:abstractNumId="12" w15:restartNumberingAfterBreak="0">
     <w:nsid w:val="3680782D"/>
     <w:multiLevelType w:val="hybridMultilevel"/>
     <w:tmpl w:val="54AE2A84"/>
@@ -3567,7 +3918,7 @@
       </w:rPr>
     </w:lvl>
   </w:abstractNum>
-  <w:abstractNum w:abstractNumId="10" w15:restartNumberingAfterBreak="0">
+  <w:abstractNum w:abstractNumId="13" w15:restartNumberingAfterBreak="0">
     <w:nsid w:val="3C496EC3"/>
     <w:multiLevelType w:val="hybridMultilevel"/>
     <w:tmpl w:val="1862C82C"/>
@@ -3680,7 +4031,7 @@
       </w:rPr>
     </w:lvl>
   </w:abstractNum>
-  <w:abstractNum w:abstractNumId="11" w15:restartNumberingAfterBreak="0">
+  <w:abstractNum w:abstractNumId="14" w15:restartNumberingAfterBreak="0">
     <w:nsid w:val="52361862"/>
     <w:multiLevelType w:val="hybridMultilevel"/>
     <w:tmpl w:val="00F27B32"/>
@@ -3792,7 +4143,7 @@
       </w:rPr>
     </w:lvl>
   </w:abstractNum>
-  <w:abstractNum w:abstractNumId="12" w15:restartNumberingAfterBreak="0">
+  <w:abstractNum w:abstractNumId="15" w15:restartNumberingAfterBreak="0">
     <w:nsid w:val="657803E8"/>
     <w:multiLevelType w:val="multilevel"/>
     <w:tmpl w:val="F9AE328E"/>
@@ -3941,7 +4292,7 @@
       </w:rPr>
     </w:lvl>
   </w:abstractNum>
-  <w:abstractNum w:abstractNumId="13" w15:restartNumberingAfterBreak="0">
+  <w:abstractNum w:abstractNumId="16" w15:restartNumberingAfterBreak="0">
     <w:nsid w:val="662B5DA3"/>
     <w:multiLevelType w:val="multilevel"/>
     <w:tmpl w:val="116A92C4"/>
@@ -4090,7 +4441,7 @@
       </w:rPr>
     </w:lvl>
   </w:abstractNum>
-  <w:abstractNum w:abstractNumId="14" w15:restartNumberingAfterBreak="0">
+  <w:abstractNum w:abstractNumId="17" w15:restartNumberingAfterBreak="0">
     <w:nsid w:val="66771E8A"/>
     <w:multiLevelType w:val="multilevel"/>
     <w:tmpl w:val="9092CDDE"/>
@@ -4239,7 +4590,7 @@
       </w:rPr>
     </w:lvl>
   </w:abstractNum>
-  <w:abstractNum w:abstractNumId="15" w15:restartNumberingAfterBreak="0">
+  <w:abstractNum w:abstractNumId="18" w15:restartNumberingAfterBreak="0">
     <w:nsid w:val="708145FD"/>
     <w:multiLevelType w:val="hybridMultilevel"/>
     <w:tmpl w:val="7624C7A0"/>
@@ -4353,25 +4704,25 @@
     </w:lvl>
   </w:abstractNum>
   <w:num w:numId="1" w16cid:durableId="737677099">
-    <w:abstractNumId w:val="14"/>
+    <w:abstractNumId w:val="17"/>
   </w:num>
   <w:num w:numId="2" w16cid:durableId="1555847543">
     <w:abstractNumId w:val="3"/>
   </w:num>
   <w:num w:numId="3" w16cid:durableId="1706785490">
-    <w:abstractNumId w:val="13"/>
+    <w:abstractNumId w:val="16"/>
   </w:num>
   <w:num w:numId="4" w16cid:durableId="40910284">
-    <w:abstractNumId w:val="7"/>
+    <w:abstractNumId w:val="10"/>
   </w:num>
   <w:num w:numId="5" w16cid:durableId="2013407067">
     <w:abstractNumId w:val="1"/>
   </w:num>
   <w:num w:numId="6" w16cid:durableId="1882666051">
-    <w:abstractNumId w:val="12"/>
+    <w:abstractNumId w:val="15"/>
   </w:num>
   <w:num w:numId="7" w16cid:durableId="671419879">
-    <w:abstractNumId w:val="5"/>
+    <w:abstractNumId w:val="8"/>
   </w:num>
   <w:num w:numId="8" w16cid:durableId="1448819085">
     <w:abstractNumId w:val="2"/>
@@ -4383,22 +4734,31 @@
     <w:abstractNumId w:val="0"/>
   </w:num>
   <w:num w:numId="11" w16cid:durableId="519051196">
+    <w:abstractNumId w:val="9"/>
+  </w:num>
+  <w:num w:numId="12" w16cid:durableId="2050643581">
+    <w:abstractNumId w:val="14"/>
+  </w:num>
+  <w:num w:numId="13" w16cid:durableId="1753967203">
+    <w:abstractNumId w:val="11"/>
+  </w:num>
+  <w:num w:numId="14" w16cid:durableId="644547332">
+    <w:abstractNumId w:val="18"/>
+  </w:num>
+  <w:num w:numId="15" w16cid:durableId="984774988">
+    <w:abstractNumId w:val="12"/>
+  </w:num>
+  <w:num w:numId="16" w16cid:durableId="88626469">
+    <w:abstractNumId w:val="13"/>
+  </w:num>
+  <w:num w:numId="17" w16cid:durableId="1263222465">
     <w:abstractNumId w:val="6"/>
   </w:num>
-  <w:num w:numId="12" w16cid:durableId="2050643581">
-    <w:abstractNumId w:val="11"/>
+  <w:num w:numId="18" w16cid:durableId="1307248283">
+    <w:abstractNumId w:val="5"/>
   </w:num>
-  <w:num w:numId="13" w16cid:durableId="1753967203">
-    <w:abstractNumId w:val="8"/>
-  </w:num>
-  <w:num w:numId="14" w16cid:durableId="644547332">
-    <w:abstractNumId w:val="15"/>
-  </w:num>
-  <w:num w:numId="15" w16cid:durableId="984774988">
-    <w:abstractNumId w:val="9"/>
-  </w:num>
-  <w:num w:numId="16" w16cid:durableId="88626469">
-    <w:abstractNumId w:val="10"/>
+  <w:num w:numId="19" w16cid:durableId="959647288">
+    <w:abstractNumId w:val="7"/>
   </w:num>
 </w:numbering>
 </file>
@@ -5342,6 +5702,36 @@
       <w:bCs/>
     </w:rPr>
   </w:style>
+  <w:style w:type="paragraph" w:styleId="HTMLPreformatted">
+    <w:name w:val="HTML Preformatted"/>
+    <w:basedOn w:val="Normal"/>
+    <w:link w:val="HTMLPreformattedChar"/>
+    <w:uiPriority w:val="99"/>
+    <w:semiHidden/>
+    <w:unhideWhenUsed/>
+    <w:rsid w:val="009B7139"/>
+    <w:pPr>
+      <w:spacing w:after="0" w:line="240" w:lineRule="auto"/>
+    </w:pPr>
+    <w:rPr>
+      <w:rFonts w:ascii="Consolas" w:hAnsi="Consolas"/>
+      <w:sz w:val="20"/>
+      <w:szCs w:val="20"/>
+    </w:rPr>
+  </w:style>
+  <w:style w:type="character" w:customStyle="1" w:styleId="HTMLPreformattedChar">
+    <w:name w:val="HTML Preformatted Char"/>
+    <w:basedOn w:val="DefaultParagraphFont"/>
+    <w:link w:val="HTMLPreformatted"/>
+    <w:uiPriority w:val="99"/>
+    <w:semiHidden/>
+    <w:rsid w:val="009B7139"/>
+    <w:rPr>
+      <w:rFonts w:ascii="Consolas" w:hAnsi="Consolas"/>
+      <w:sz w:val="20"/>
+      <w:szCs w:val="20"/>
+    </w:rPr>
+  </w:style>
 </w:styles>
 </file>
 

</xml_diff>